<commit_message>
Message Object now has typewriter functionality
</commit_message>
<xml_diff>
--- a/docs/PygameTkinterGUITools_CheatSheet.docx
+++ b/docs/PygameTkinterGUITools_CheatSheet.docx
@@ -1647,6 +1647,203 @@
       </w:r>
     </w:p>
     <w:p>
+      <w:pPr>
+        <w:keepNext/>
+        <w:spacing w:after="30" w:before="100"/>
+      </w:pPr>
+      <w:r>
+        <w:rPr>
+          <w:rFonts w:ascii="Calibri" w:cs="Calibri" w:eastAsia="Calibri" w:hAnsi="Calibri"/>
+          <w:b/>
+          <w:bCs/>
+          <w:color w:val="1F4E79"/>
+          <w:sz w:val="20"/>
+          <w:szCs w:val="20"/>
+        </w:rPr>
+        <w:t xml:space="preserve">Typewriter text (like Pokemon dialogue)</w:t>
+      </w:r>
+    </w:p>
+    <w:p>
+      <w:pPr>
+        <w:keepNext/>
+        <w:keepLines/>
+        <w:shd w:fill="F2F4F7" w:color="auto" w:val="clear"/>
+        <w:spacing w:after="0" w:before="20" w:line="220"/>
+        <w:ind w:left="60"/>
+      </w:pPr>
+      <w:r>
+        <w:rPr>
+          <w:rFonts w:ascii="Consolas" w:cs="Consolas" w:eastAsia="Consolas" w:hAnsi="Consolas"/>
+          <w:color w:val="000000"/>
+          <w:sz w:val="14"/>
+          <w:szCs w:val="14"/>
+        </w:rPr>
+        <w:t>talk = Message(20, 400, "Hello!", width=500,</w:t>
+      </w:r>
+    </w:p>
+    <w:p>
+      <w:pPr>
+        <w:keepNext/>
+        <w:keepLines/>
+        <w:shd w:fill="F2F4F7" w:color="auto" w:val="clear"/>
+        <w:spacing w:after="0" w:before="0" w:line="220"/>
+        <w:ind w:left="60"/>
+      </w:pPr>
+      <w:r>
+        <w:rPr>
+          <w:rFonts w:ascii="Consolas" w:cs="Consolas" w:eastAsia="Consolas" w:hAnsi="Consolas"/>
+          <w:color w:val="000000"/>
+          <w:sz w:val="14"/>
+          <w:szCs w:val="14"/>
+        </w:rPr>
+        <w:t xml:space="preserve">               type_speed=30,       # letters per second</w:t>
+      </w:r>
+    </w:p>
+    <w:p>
+      <w:pPr>
+        <w:keepNext/>
+        <w:keepLines/>
+        <w:shd w:fill="F2F4F7" w:color="auto" w:val="clear"/>
+        <w:spacing w:after="0" w:before="0" w:line="220"/>
+        <w:ind w:left="60"/>
+      </w:pPr>
+      <w:r>
+        <w:rPr>
+          <w:rFonts w:ascii="Consolas" w:cs="Consolas" w:eastAsia="Consolas" w:hAnsi="Consolas"/>
+          <w:color w:val="000000"/>
+          <w:sz w:val="14"/>
+          <w:szCs w:val="14"/>
+        </w:rPr>
+        <w:t xml:space="preserve">               type_sound=SoundEffect("click.wav"),</w:t>
+      </w:r>
+    </w:p>
+    <w:p>
+      <w:pPr>
+        <w:keepNext/>
+        <w:keepLines/>
+        <w:shd w:fill="F2F4F7" w:color="auto" w:val="clear"/>
+        <w:spacing w:after="0" w:before="0" w:line="220"/>
+        <w:ind w:left="60"/>
+      </w:pPr>
+      <w:r>
+        <w:rPr>
+          <w:rFonts w:ascii="Consolas" w:cs="Consolas" w:eastAsia="Consolas" w:hAnsi="Consolas"/>
+          <w:color w:val="000000"/>
+          <w:sz w:val="14"/>
+          <w:szCs w:val="14"/>
+        </w:rPr>
+        <w:t xml:space="preserve">               on_done=show_arrow)  # at the end</w:t>
+      </w:r>
+    </w:p>
+    <w:p>
+      <w:pPr>
+        <w:keepNext/>
+        <w:keepLines/>
+        <w:shd w:fill="F2F4F7" w:color="auto" w:val="clear"/>
+        <w:spacing w:after="0" w:before="0" w:line="220"/>
+        <w:ind w:left="60"/>
+      </w:pPr>
+      <w:r>
+        <w:rPr>
+          <w:rFonts w:ascii="Consolas" w:cs="Consolas" w:eastAsia="Consolas" w:hAnsi="Consolas"/>
+          <w:color w:val="000000"/>
+          <w:sz w:val="14"/>
+          <w:szCs w:val="14"/>
+        </w:rPr>
+        <w:t>talk.update(tick)                   # types the next letters</w:t>
+      </w:r>
+    </w:p>
+    <w:p>
+      <w:pPr>
+        <w:keepNext/>
+        <w:keepLines/>
+        <w:shd w:fill="F2F4F7" w:color="auto" w:val="clear"/>
+        <w:spacing w:after="0" w:before="0" w:line="220"/>
+        <w:ind w:left="60"/>
+      </w:pPr>
+      <w:r>
+        <w:rPr>
+          <w:rFonts w:ascii="Consolas" w:cs="Consolas" w:eastAsia="Consolas" w:hAnsi="Consolas"/>
+          <w:color w:val="000000"/>
+          <w:sz w:val="14"/>
+          <w:szCs w:val="14"/>
+        </w:rPr>
+        <w:t>if talk.handle_event(event):        # True = showed the rest,</w:t>
+      </w:r>
+    </w:p>
+    <w:p>
+      <w:pPr>
+        <w:keepNext/>
+        <w:keepLines/>
+        <w:shd w:fill="F2F4F7" w:color="auto" w:val="clear"/>
+        <w:spacing w:after="0" w:before="0" w:line="220"/>
+        <w:ind w:left="60"/>
+      </w:pPr>
+      <w:r>
+        <w:rPr>
+          <w:rFonts w:ascii="Consolas" w:cs="Consolas" w:eastAsia="Consolas" w:hAnsi="Consolas"/>
+          <w:color w:val="000000"/>
+          <w:sz w:val="14"/>
+          <w:szCs w:val="14"/>
+        </w:rPr>
+        <w:t xml:space="preserve">    continue                        # so don't go to next line</w:t>
+      </w:r>
+    </w:p>
+    <w:p>
+      <w:pPr>
+        <w:keepNext/>
+        <w:keepLines/>
+        <w:shd w:fill="F2F4F7" w:color="auto" w:val="clear"/>
+        <w:spacing w:after="0" w:before="0" w:line="220"/>
+        <w:ind w:left="60"/>
+      </w:pPr>
+      <w:r>
+        <w:rPr>
+          <w:rFonts w:ascii="Consolas" w:cs="Consolas" w:eastAsia="Consolas" w:hAnsi="Consolas"/>
+          <w:color w:val="000000"/>
+          <w:sz w:val="14"/>
+          <w:szCs w:val="14"/>
+        </w:rPr>
+        <w:t>talk.config(text="Next line")       # types out again</w:t>
+      </w:r>
+    </w:p>
+    <w:p>
+      <w:pPr>
+        <w:keepNext/>
+        <w:keepLines/>
+        <w:shd w:fill="F2F4F7" w:color="auto" w:val="clear"/>
+        <w:spacing w:after="0" w:before="0" w:line="220"/>
+        <w:ind w:left="60"/>
+      </w:pPr>
+      <w:r>
+        <w:rPr>
+          <w:rFonts w:ascii="Consolas" w:cs="Consolas" w:eastAsia="Consolas" w:hAnsi="Consolas"/>
+          <w:color w:val="000000"/>
+          <w:sz w:val="14"/>
+          <w:szCs w:val="14"/>
+        </w:rPr>
+        <w:t>talk.typing    talk.skip()    talk.restart()</w:t>
+      </w:r>
+    </w:p>
+    <w:p>
+      <w:pPr>
+        <w:keepNext w:val="false"/>
+        <w:keepLines/>
+        <w:shd w:fill="F2F4F7" w:color="auto" w:val="clear"/>
+        <w:spacing w:after="40" w:before="0" w:line="220"/>
+        <w:ind w:left="60"/>
+      </w:pPr>
+      <w:r>
+        <w:rPr>
+          <w:rFonts w:ascii="Consolas" w:cs="Consolas" w:eastAsia="Consolas" w:hAnsi="Consolas"/>
+          <w:color w:val="2E7D32"/>
+          <w:sz w:val="14"/>
+          <w:szCs w:val="14"/>
+        </w:rPr>
+        <w:t># MessageBox(..., type_speed=30) works too: box.update(tick)</w:t>
+      </w:r>
+    </w:p>
+    <w:p>
       <w:r>
         <w:br w:type="page"/>
       </w:r>
@@ -2104,7 +2301,25 @@
           <w:sz w:val="14"/>
           <w:szCs w:val="14"/>
         </w:rPr>
-        <w:t xml:space="preserve">popup = Popup(400, 300, 300, 200, "Game Over")</w:t>
+        <w:t xml:space="preserve">popup = Popup(400, 300, 300, 200, "Game Over",</w:t>
+      </w:r>
+    </w:p>
+    <w:p>
+      <w:pPr>
+        <w:keepNext/>
+        <w:keepLines/>
+        <w:shd w:fill="F2F4F7" w:color="auto" w:val="clear"/>
+        <w:spacing w:after="0" w:before="0" w:line="220"/>
+        <w:ind w:left="60"/>
+      </w:pPr>
+      <w:r>
+        <w:rPr>
+          <w:rFonts w:ascii="Consolas" w:cs="Consolas" w:eastAsia="Consolas" w:hAnsi="Consolas"/>
+          <w:color w:val="000000"/>
+          <w:sz w:val="14"/>
+          <w:szCs w:val="14"/>
+        </w:rPr>
+        <w:t xml:space="preserve">              title_font_size=36)      # title size (24)</w:t>
       </w:r>
     </w:p>
     <w:p>
@@ -2175,7 +2390,7 @@
           <w:sz w:val="20"/>
           <w:szCs w:val="20"/>
         </w:rPr>
-        <w:t xml:space="preserve">Menus</w:t>
+        <w:t xml:space="preserve">Question boxes (like messagebox)</w:t>
       </w:r>
     </w:p>
     <w:p>
@@ -2193,187 +2408,115 @@
           <w:sz w:val="14"/>
           <w:szCs w:val="14"/>
         </w:rPr>
-        <w:t xml:space="preserve">menubar = Menu(root)</w:t>
-      </w:r>
-    </w:p>
-    <w:p>
-      <w:pPr>
-        <w:keepNext/>
-        <w:keepLines/>
-        <w:shd w:fill="F2F4F7" w:color="auto" w:val="clear"/>
-        <w:spacing w:after="0" w:before="0" w:line="220"/>
-        <w:ind w:left="60"/>
-      </w:pPr>
-      <w:r>
-        <w:rPr>
-          <w:rFonts w:ascii="Consolas" w:cs="Consolas" w:eastAsia="Consolas" w:hAnsi="Consolas"/>
-          <w:color w:val="000000"/>
-          <w:sz w:val="14"/>
-          <w:szCs w:val="14"/>
-        </w:rPr>
-        <w:t xml:space="preserve">file_menu = Menu(menubar)</w:t>
-      </w:r>
-    </w:p>
-    <w:p>
-      <w:pPr>
-        <w:keepNext/>
-        <w:keepLines/>
-        <w:shd w:fill="F2F4F7" w:color="auto" w:val="clear"/>
-        <w:spacing w:after="0" w:before="0" w:line="220"/>
-        <w:ind w:left="60"/>
-      </w:pPr>
-      <w:r>
-        <w:rPr>
-          <w:rFonts w:ascii="Consolas" w:cs="Consolas" w:eastAsia="Consolas" w:hAnsi="Consolas"/>
-          <w:color w:val="000000"/>
-          <w:sz w:val="14"/>
-          <w:szCs w:val="14"/>
-        </w:rPr>
-        <w:t xml:space="preserve">file_menu.add_command(label="Save", command=save,</w:t>
-      </w:r>
-    </w:p>
-    <w:p>
-      <w:pPr>
-        <w:keepNext/>
-        <w:keepLines/>
-        <w:shd w:fill="F2F4F7" w:color="auto" w:val="clear"/>
-        <w:spacing w:after="0" w:before="0" w:line="220"/>
-        <w:ind w:left="60"/>
-      </w:pPr>
-      <w:r>
-        <w:rPr>
-          <w:rFonts w:ascii="Consolas" w:cs="Consolas" w:eastAsia="Consolas" w:hAnsi="Consolas"/>
-          <w:color w:val="000000"/>
-          <w:sz w:val="14"/>
-          <w:szCs w:val="14"/>
-        </w:rPr>
-        <w:t xml:space="preserve">                      accelerator="Ctrl+S")  # it works</w:t>
-      </w:r>
-    </w:p>
-    <w:p>
-      <w:pPr>
-        <w:keepNext/>
-        <w:keepLines/>
-        <w:shd w:fill="F2F4F7" w:color="auto" w:val="clear"/>
-        <w:spacing w:after="0" w:before="0" w:line="220"/>
-        <w:ind w:left="60"/>
-      </w:pPr>
-      <w:r>
-        <w:rPr>
-          <w:rFonts w:ascii="Consolas" w:cs="Consolas" w:eastAsia="Consolas" w:hAnsi="Consolas"/>
-          <w:color w:val="000000"/>
-          <w:sz w:val="14"/>
-          <w:szCs w:val="14"/>
-        </w:rPr>
-        <w:t xml:space="preserve">file_menu.add_separator()</w:t>
-      </w:r>
-    </w:p>
-    <w:p>
-      <w:pPr>
-        <w:keepNext/>
-        <w:keepLines/>
-        <w:shd w:fill="F2F4F7" w:color="auto" w:val="clear"/>
-        <w:spacing w:after="0" w:before="0" w:line="220"/>
-        <w:ind w:left="60"/>
-      </w:pPr>
-      <w:r>
-        <w:rPr>
-          <w:rFonts w:ascii="Consolas" w:cs="Consolas" w:eastAsia="Consolas" w:hAnsi="Consolas"/>
-          <w:color w:val="000000"/>
-          <w:sz w:val="14"/>
-          <w:szCs w:val="14"/>
-        </w:rPr>
-        <w:t xml:space="preserve">file_menu.add_checkbutton(label="Music", variable=music)</w:t>
-      </w:r>
-    </w:p>
-    <w:p>
-      <w:pPr>
-        <w:keepNext/>
-        <w:keepLines/>
-        <w:shd w:fill="F2F4F7" w:color="auto" w:val="clear"/>
-        <w:spacing w:after="0" w:before="0" w:line="220"/>
-        <w:ind w:left="60"/>
-      </w:pPr>
-      <w:r>
-        <w:rPr>
-          <w:rFonts w:ascii="Consolas" w:cs="Consolas" w:eastAsia="Consolas" w:hAnsi="Consolas"/>
-          <w:color w:val="000000"/>
-          <w:sz w:val="14"/>
-          <w:szCs w:val="14"/>
-        </w:rPr>
-        <w:t xml:space="preserve">menubar.add_cascade(label="File", menu=file_menu)</w:t>
-      </w:r>
-    </w:p>
-    <w:p>
-      <w:pPr>
-        <w:keepNext/>
-        <w:keepLines/>
-        <w:shd w:fill="F2F4F7" w:color="auto" w:val="clear"/>
-        <w:spacing w:after="0" w:before="0" w:line="220"/>
-        <w:ind w:left="60"/>
-      </w:pPr>
-      <w:r>
-        <w:rPr>
-          <w:rFonts w:ascii="Consolas" w:cs="Consolas" w:eastAsia="Consolas" w:hAnsi="Consolas"/>
-          <w:color w:val="000000"/>
-          <w:sz w:val="14"/>
-          <w:szCs w:val="14"/>
-        </w:rPr>
-        <w:t xml:space="preserve">root.config(menu=menubar)            # bar across the top</w:t>
-      </w:r>
-    </w:p>
-    <w:p>
-      <w:pPr>
-        <w:keepNext/>
-        <w:keepLines/>
-        <w:shd w:fill="F2F4F7" w:color="auto" w:val="clear"/>
-        <w:spacing w:after="0" w:before="0" w:line="220"/>
-        <w:ind w:left="60"/>
-      </w:pPr>
-      <w:r>
-        <w:rPr>
-          <w:rFonts w:ascii="Consolas" w:cs="Consolas" w:eastAsia="Consolas" w:hAnsi="Consolas"/>
-          <w:color w:val="000000"/>
-          <w:sz w:val="14"/>
-          <w:szCs w:val="14"/>
-        </w:rPr>
-        <w:t xml:space="preserve"> </w:t>
-      </w:r>
-    </w:p>
-    <w:p>
-      <w:pPr>
-        <w:keepNext/>
-        <w:keepLines/>
-        <w:shd w:fill="F2F4F7" w:color="auto" w:val="clear"/>
-        <w:spacing w:after="0" w:before="0" w:line="220"/>
-        <w:ind w:left="60"/>
-      </w:pPr>
-      <w:r>
-        <w:rPr>
-          <w:rFonts w:ascii="Consolas" w:cs="Consolas" w:eastAsia="Consolas" w:hAnsi="Consolas"/>
-          <w:color w:val="000000"/>
-          <w:sz w:val="14"/>
-          <w:szCs w:val="14"/>
-        </w:rPr>
-        <w:t xml:space="preserve">context = Menu()                       # right-click menu</w:t>
-      </w:r>
-    </w:p>
-    <w:p>
-      <w:pPr>
-        <w:keepNext/>
-        <w:keepLines/>
-        <w:shd w:fill="F2F4F7" w:color="auto" w:val="clear"/>
-        <w:spacing w:after="0" w:before="0" w:line="220"/>
-        <w:ind w:left="60"/>
-      </w:pPr>
-      <w:r>
-        <w:rPr>
-          <w:rFonts w:ascii="Consolas" w:cs="Consolas" w:eastAsia="Consolas" w:hAnsi="Consolas"/>
-          <w:color w:val="000000"/>
-          <w:sz w:val="14"/>
-          <w:szCs w:val="14"/>
-        </w:rPr>
-        <w:t xml:space="preserve">context.post(*event.pos)</w:t>
+        <w:t xml:space="preserve">def answer(yes):        # True / False / None (Cancel)</w:t>
+      </w:r>
+    </w:p>
+    <w:p>
+      <w:pPr>
+        <w:keepNext/>
+        <w:keepLines/>
+        <w:shd w:fill="F2F4F7" w:color="auto" w:val="clear"/>
+        <w:spacing w:after="0" w:before="0" w:line="220"/>
+        <w:ind w:left="60"/>
+      </w:pPr>
+      <w:r>
+        <w:rPr>
+          <w:rFonts w:ascii="Consolas" w:cs="Consolas" w:eastAsia="Consolas" w:hAnsi="Consolas"/>
+          <w:color w:val="000000"/>
+          <w:sz w:val="14"/>
+          <w:szCs w:val="14"/>
+        </w:rPr>
+        <w:t xml:space="preserve">    ...</w:t>
+      </w:r>
+    </w:p>
+    <w:p>
+      <w:pPr>
+        <w:keepNext/>
+        <w:keepLines/>
+        <w:shd w:fill="F2F4F7" w:color="auto" w:val="clear"/>
+        <w:spacing w:after="0" w:before="0" w:line="220"/>
+        <w:ind w:left="60"/>
+      </w:pPr>
+      <w:r>
+        <w:rPr>
+          <w:rFonts w:ascii="Consolas" w:cs="Consolas" w:eastAsia="Consolas" w:hAnsi="Consolas"/>
+          <w:color w:val="000000"/>
+          <w:sz w:val="14"/>
+          <w:szCs w:val="14"/>
+        </w:rPr>
+        <w:t xml:space="preserve">box = askyesnocancel("Quit?", "Save first?",</w:t>
+      </w:r>
+    </w:p>
+    <w:p>
+      <w:pPr>
+        <w:keepNext/>
+        <w:keepLines/>
+        <w:shd w:fill="F2F4F7" w:color="auto" w:val="clear"/>
+        <w:spacing w:after="0" w:before="0" w:line="220"/>
+        <w:ind w:left="60"/>
+      </w:pPr>
+      <w:r>
+        <w:rPr>
+          <w:rFonts w:ascii="Consolas" w:cs="Consolas" w:eastAsia="Consolas" w:hAnsi="Consolas"/>
+          <w:color w:val="000000"/>
+          <w:sz w:val="14"/>
+          <w:szCs w:val="14"/>
+        </w:rPr>
+        <w:t xml:space="preserve">                     command=answer)   # opens now</w:t>
+      </w:r>
+    </w:p>
+    <w:p>
+      <w:pPr>
+        <w:keepNext/>
+        <w:keepLines/>
+        <w:shd w:fill="F2F4F7" w:color="auto" w:val="clear"/>
+        <w:spacing w:after="0" w:before="0" w:line="220"/>
+        <w:ind w:left="60"/>
+      </w:pPr>
+      <w:r>
+        <w:rPr>
+          <w:rFonts w:ascii="Consolas" w:cs="Consolas" w:eastAsia="Consolas" w:hAnsi="Consolas"/>
+          <w:color w:val="2E7D32"/>
+          <w:sz w:val="14"/>
+          <w:szCs w:val="14"/>
+        </w:rPr>
+        <w:t xml:space="preserve"># also askyesno askokcancel showinfo, or your own:</w:t>
+      </w:r>
+    </w:p>
+    <w:p>
+      <w:pPr>
+        <w:keepNext/>
+        <w:keepLines/>
+        <w:shd w:fill="F2F4F7" w:color="auto" w:val="clear"/>
+        <w:spacing w:after="0" w:before="0" w:line="220"/>
+        <w:ind w:left="60"/>
+      </w:pPr>
+      <w:r>
+        <w:rPr>
+          <w:rFonts w:ascii="Consolas" w:cs="Consolas" w:eastAsia="Consolas" w:hAnsi="Consolas"/>
+          <w:color w:val="000000"/>
+          <w:sz w:val="14"/>
+          <w:szCs w:val="14"/>
+        </w:rPr>
+        <w:t xml:space="preserve">box = MessageBox("Shop", "Buy it?",</w:t>
+      </w:r>
+    </w:p>
+    <w:p>
+      <w:pPr>
+        <w:keepNext/>
+        <w:keepLines/>
+        <w:shd w:fill="F2F4F7" w:color="auto" w:val="clear"/>
+        <w:spacing w:after="0" w:before="0" w:line="220"/>
+        <w:ind w:left="60"/>
+      </w:pPr>
+      <w:r>
+        <w:rPr>
+          <w:rFonts w:ascii="Consolas" w:cs="Consolas" w:eastAsia="Consolas" w:hAnsi="Consolas"/>
+          <w:color w:val="000000"/>
+          <w:sz w:val="14"/>
+          <w:szCs w:val="14"/>
+        </w:rPr>
+        <w:t xml:space="preserve">                 buttons=("Buy", "No"), command=f)</w:t>
       </w:r>
     </w:p>
     <w:p>
@@ -2387,11 +2530,11 @@
       <w:r>
         <w:rPr>
           <w:rFonts w:ascii="Consolas" w:cs="Consolas" w:eastAsia="Consolas" w:hAnsi="Consolas"/>
-          <w:color w:val="2E7D32"/>
-          <w:sz w:val="14"/>
-          <w:szCs w:val="14"/>
-        </w:rPr>
-        <w:t xml:space="preserve"># handle_event FIRST, draw LAST</w:t>
+          <w:color w:val="000000"/>
+          <w:sz w:val="14"/>
+          <w:szCs w:val="14"/>
+        </w:rPr>
+        <w:t xml:space="preserve">box.handle_event(event)  # FIRST    box.draw(screen) LAST</w:t>
       </w:r>
     </w:p>
     <w:p>
@@ -2408,7 +2551,7 @@
           <w:sz w:val="20"/>
           <w:szCs w:val="20"/>
         </w:rPr>
-        <w:t xml:space="preserve">Table (like ttk.Treeview)</w:t>
+        <w:t xml:space="preserve">Menus</w:t>
       </w:r>
     </w:p>
     <w:p>
@@ -2426,105 +2569,195 @@
           <w:sz w:val="14"/>
           <w:szCs w:val="14"/>
         </w:rPr>
-        <w:t xml:space="preserve">items = Table(root, columns=["Item", "Price"], rows=8,</w:t>
-      </w:r>
-    </w:p>
-    <w:p>
-      <w:pPr>
-        <w:keepNext/>
-        <w:keepLines/>
-        <w:shd w:fill="F2F4F7" w:color="auto" w:val="clear"/>
-        <w:spacing w:after="0" w:before="0" w:line="220"/>
-        <w:ind w:left="60"/>
-      </w:pPr>
-      <w:r>
-        <w:rPr>
-          <w:rFonts w:ascii="Consolas" w:cs="Consolas" w:eastAsia="Consolas" w:hAnsi="Consolas"/>
-          <w:color w:val="000000"/>
-          <w:sz w:val="14"/>
-          <w:szCs w:val="14"/>
-        </w:rPr>
-        <w:t xml:space="preserve">              editable=["Price"], on_edit=changed)</w:t>
-      </w:r>
-    </w:p>
-    <w:p>
-      <w:pPr>
-        <w:keepNext/>
-        <w:keepLines/>
-        <w:shd w:fill="F2F4F7" w:color="auto" w:val="clear"/>
-        <w:spacing w:after="0" w:before="0" w:line="220"/>
-        <w:ind w:left="60"/>
-      </w:pPr>
-      <w:r>
-        <w:rPr>
-          <w:rFonts w:ascii="Consolas" w:cs="Consolas" w:eastAsia="Consolas" w:hAnsi="Consolas"/>
-          <w:color w:val="000000"/>
-          <w:sz w:val="14"/>
-          <w:szCs w:val="14"/>
-        </w:rPr>
-        <w:t xml:space="preserve">items.column("Price", type=int, anchor="e")</w:t>
-      </w:r>
-    </w:p>
-    <w:p>
-      <w:pPr>
-        <w:keepNext/>
-        <w:keepLines/>
-        <w:shd w:fill="F2F4F7" w:color="auto" w:val="clear"/>
-        <w:spacing w:after="0" w:before="0" w:line="220"/>
-        <w:ind w:left="60"/>
-      </w:pPr>
-      <w:r>
-        <w:rPr>
-          <w:rFonts w:ascii="Consolas" w:cs="Consolas" w:eastAsia="Consolas" w:hAnsi="Consolas"/>
-          <w:color w:val="000000"/>
-          <w:sz w:val="14"/>
-          <w:szCs w:val="14"/>
-        </w:rPr>
-        <w:t xml:space="preserve">row = items.insert(["Sword", 45])</w:t>
-      </w:r>
-    </w:p>
-    <w:p>
-      <w:pPr>
-        <w:keepNext/>
-        <w:keepLines/>
-        <w:shd w:fill="F2F4F7" w:color="auto" w:val="clear"/>
-        <w:spacing w:after="0" w:before="0" w:line="220"/>
-        <w:ind w:left="60"/>
-      </w:pPr>
-      <w:r>
-        <w:rPr>
-          <w:rFonts w:ascii="Consolas" w:cs="Consolas" w:eastAsia="Consolas" w:hAnsi="Consolas"/>
-          <w:color w:val="000000"/>
-          <w:sz w:val="14"/>
-          <w:szCs w:val="14"/>
-        </w:rPr>
-        <w:t xml:space="preserve">items.get_selected()         # ["Sword", 45] or None</w:t>
-      </w:r>
-    </w:p>
-    <w:p>
-      <w:pPr>
-        <w:keepNext/>
-        <w:keepLines/>
-        <w:shd w:fill="F2F4F7" w:color="auto" w:val="clear"/>
-        <w:spacing w:after="0" w:before="0" w:line="220"/>
-        <w:ind w:left="60"/>
-      </w:pPr>
-      <w:r>
-        <w:rPr>
-          <w:rFonts w:ascii="Consolas" w:cs="Consolas" w:eastAsia="Consolas" w:hAnsi="Consolas"/>
-          <w:color w:val="000000"/>
-          <w:sz w:val="14"/>
-          <w:szCs w:val="14"/>
-        </w:rPr>
-        <w:t xml:space="preserve">items.load(list_of_rows)      items.delete(row)</w:t>
-      </w:r>
-    </w:p>
-    <w:p>
-      <w:pPr>
-        <w:keepNext/>
-        <w:keepLines/>
-        <w:shd w:fill="F2F4F7" w:color="auto" w:val="clear"/>
-        <w:spacing w:after="0" w:before="0" w:line="220"/>
+        <w:t xml:space="preserve">menubar = Menu(root)</w:t>
+      </w:r>
+    </w:p>
+    <w:p>
+      <w:pPr>
+        <w:keepNext/>
+        <w:keepLines/>
+        <w:shd w:fill="F2F4F7" w:color="auto" w:val="clear"/>
+        <w:spacing w:after="0" w:before="0" w:line="220"/>
+        <w:ind w:left="60"/>
+      </w:pPr>
+      <w:r>
+        <w:rPr>
+          <w:rFonts w:ascii="Consolas" w:cs="Consolas" w:eastAsia="Consolas" w:hAnsi="Consolas"/>
+          <w:color w:val="000000"/>
+          <w:sz w:val="14"/>
+          <w:szCs w:val="14"/>
+        </w:rPr>
+        <w:t xml:space="preserve">file_menu = Menu(menubar)</w:t>
+      </w:r>
+    </w:p>
+    <w:p>
+      <w:pPr>
+        <w:keepNext/>
+        <w:keepLines/>
+        <w:shd w:fill="F2F4F7" w:color="auto" w:val="clear"/>
+        <w:spacing w:after="0" w:before="0" w:line="220"/>
+        <w:ind w:left="60"/>
+      </w:pPr>
+      <w:r>
+        <w:rPr>
+          <w:rFonts w:ascii="Consolas" w:cs="Consolas" w:eastAsia="Consolas" w:hAnsi="Consolas"/>
+          <w:color w:val="000000"/>
+          <w:sz w:val="14"/>
+          <w:szCs w:val="14"/>
+        </w:rPr>
+        <w:t xml:space="preserve">file_menu.add_command(label="Save", command=save,</w:t>
+      </w:r>
+    </w:p>
+    <w:p>
+      <w:pPr>
+        <w:keepNext/>
+        <w:keepLines/>
+        <w:shd w:fill="F2F4F7" w:color="auto" w:val="clear"/>
+        <w:spacing w:after="0" w:before="0" w:line="220"/>
+        <w:ind w:left="60"/>
+      </w:pPr>
+      <w:r>
+        <w:rPr>
+          <w:rFonts w:ascii="Consolas" w:cs="Consolas" w:eastAsia="Consolas" w:hAnsi="Consolas"/>
+          <w:color w:val="000000"/>
+          <w:sz w:val="14"/>
+          <w:szCs w:val="14"/>
+        </w:rPr>
+        <w:t xml:space="preserve">                      accelerator="Ctrl+S")  # it works</w:t>
+      </w:r>
+    </w:p>
+    <w:p>
+      <w:pPr>
+        <w:keepNext/>
+        <w:keepLines/>
+        <w:shd w:fill="F2F4F7" w:color="auto" w:val="clear"/>
+        <w:spacing w:after="0" w:before="0" w:line="220"/>
+        <w:ind w:left="60"/>
+      </w:pPr>
+      <w:r>
+        <w:rPr>
+          <w:rFonts w:ascii="Consolas" w:cs="Consolas" w:eastAsia="Consolas" w:hAnsi="Consolas"/>
+          <w:color w:val="000000"/>
+          <w:sz w:val="14"/>
+          <w:szCs w:val="14"/>
+        </w:rPr>
+        <w:t xml:space="preserve">file_menu.add_separator()</w:t>
+      </w:r>
+    </w:p>
+    <w:p>
+      <w:pPr>
+        <w:keepNext/>
+        <w:keepLines/>
+        <w:shd w:fill="F2F4F7" w:color="auto" w:val="clear"/>
+        <w:spacing w:after="0" w:before="0" w:line="220"/>
+        <w:ind w:left="60"/>
+      </w:pPr>
+      <w:r>
+        <w:rPr>
+          <w:rFonts w:ascii="Consolas" w:cs="Consolas" w:eastAsia="Consolas" w:hAnsi="Consolas"/>
+          <w:color w:val="000000"/>
+          <w:sz w:val="14"/>
+          <w:szCs w:val="14"/>
+        </w:rPr>
+        <w:t xml:space="preserve">file_menu.add_checkbutton(label="Music", variable=music)</w:t>
+      </w:r>
+    </w:p>
+    <w:p>
+      <w:pPr>
+        <w:keepNext/>
+        <w:keepLines/>
+        <w:shd w:fill="F2F4F7" w:color="auto" w:val="clear"/>
+        <w:spacing w:after="0" w:before="0" w:line="220"/>
+        <w:ind w:left="60"/>
+      </w:pPr>
+      <w:r>
+        <w:rPr>
+          <w:rFonts w:ascii="Consolas" w:cs="Consolas" w:eastAsia="Consolas" w:hAnsi="Consolas"/>
+          <w:color w:val="000000"/>
+          <w:sz w:val="14"/>
+          <w:szCs w:val="14"/>
+        </w:rPr>
+        <w:t xml:space="preserve">menubar.add_cascade(label="File", menu=file_menu)</w:t>
+      </w:r>
+    </w:p>
+    <w:p>
+      <w:pPr>
+        <w:keepNext/>
+        <w:keepLines/>
+        <w:shd w:fill="F2F4F7" w:color="auto" w:val="clear"/>
+        <w:spacing w:after="0" w:before="0" w:line="220"/>
+        <w:ind w:left="60"/>
+      </w:pPr>
+      <w:r>
+        <w:rPr>
+          <w:rFonts w:ascii="Consolas" w:cs="Consolas" w:eastAsia="Consolas" w:hAnsi="Consolas"/>
+          <w:color w:val="000000"/>
+          <w:sz w:val="14"/>
+          <w:szCs w:val="14"/>
+        </w:rPr>
+        <w:t xml:space="preserve">root.config(menu=menubar)            # bar across the top</w:t>
+      </w:r>
+    </w:p>
+    <w:p>
+      <w:pPr>
+        <w:keepNext/>
+        <w:keepLines/>
+        <w:shd w:fill="F2F4F7" w:color="auto" w:val="clear"/>
+        <w:spacing w:after="0" w:before="0" w:line="220"/>
+        <w:ind w:left="60"/>
+      </w:pPr>
+      <w:r>
+        <w:rPr>
+          <w:rFonts w:ascii="Consolas" w:cs="Consolas" w:eastAsia="Consolas" w:hAnsi="Consolas"/>
+          <w:color w:val="000000"/>
+          <w:sz w:val="14"/>
+          <w:szCs w:val="14"/>
+        </w:rPr>
+        <w:t xml:space="preserve"> </w:t>
+      </w:r>
+    </w:p>
+    <w:p>
+      <w:pPr>
+        <w:keepNext/>
+        <w:keepLines/>
+        <w:shd w:fill="F2F4F7" w:color="auto" w:val="clear"/>
+        <w:spacing w:after="0" w:before="0" w:line="220"/>
+        <w:ind w:left="60"/>
+      </w:pPr>
+      <w:r>
+        <w:rPr>
+          <w:rFonts w:ascii="Consolas" w:cs="Consolas" w:eastAsia="Consolas" w:hAnsi="Consolas"/>
+          <w:color w:val="000000"/>
+          <w:sz w:val="14"/>
+          <w:szCs w:val="14"/>
+        </w:rPr>
+        <w:t xml:space="preserve">context = Menu()                       # right-click menu</w:t>
+      </w:r>
+    </w:p>
+    <w:p>
+      <w:pPr>
+        <w:keepNext/>
+        <w:keepLines/>
+        <w:shd w:fill="F2F4F7" w:color="auto" w:val="clear"/>
+        <w:spacing w:after="0" w:before="0" w:line="220"/>
+        <w:ind w:left="60"/>
+      </w:pPr>
+      <w:r>
+        <w:rPr>
+          <w:rFonts w:ascii="Consolas" w:cs="Consolas" w:eastAsia="Consolas" w:hAnsi="Consolas"/>
+          <w:color w:val="000000"/>
+          <w:sz w:val="14"/>
+          <w:szCs w:val="14"/>
+        </w:rPr>
+        <w:t xml:space="preserve">context.post(*event.pos)</w:t>
+      </w:r>
+    </w:p>
+    <w:p>
+      <w:pPr>
+        <w:keepNext w:val="false"/>
+        <w:keepLines/>
+        <w:shd w:fill="F2F4F7" w:color="auto" w:val="clear"/>
+        <w:spacing w:after="40" w:before="0" w:line="220"/>
         <w:ind w:left="60"/>
       </w:pPr>
       <w:r>
@@ -2534,56 +2767,7 @@
           <w:sz w:val="14"/>
           <w:szCs w:val="14"/>
         </w:rPr>
-        <w:t xml:space="preserve"># tree view: Table(..., tree=True)</w:t>
-      </w:r>
-    </w:p>
-    <w:p>
-      <w:pPr>
-        <w:keepNext/>
-        <w:keepLines/>
-        <w:shd w:fill="F2F4F7" w:color="auto" w:val="clear"/>
-        <w:spacing w:after="0" w:before="0" w:line="220"/>
-        <w:ind w:left="60"/>
-      </w:pPr>
-      <w:r>
-        <w:rPr>
-          <w:rFonts w:ascii="Consolas" w:cs="Consolas" w:eastAsia="Consolas" w:hAnsi="Consolas"/>
-          <w:color w:val="000000"/>
-          <w:sz w:val="14"/>
-          <w:szCs w:val="14"/>
-        </w:rPr>
-        <w:t xml:space="preserve">world = tree.insert(["World 1"], open=True)</w:t>
-      </w:r>
-    </w:p>
-    <w:p>
-      <w:pPr>
-        <w:keepNext w:val="false"/>
-        <w:keepLines/>
-        <w:shd w:fill="F2F4F7" w:color="auto" w:val="clear"/>
-        <w:spacing w:after="40" w:before="0" w:line="220"/>
-        <w:ind w:left="60"/>
-      </w:pPr>
-      <w:r>
-        <w:rPr>
-          <w:rFonts w:ascii="Consolas" w:cs="Consolas" w:eastAsia="Consolas" w:hAnsi="Consolas"/>
-          <w:color w:val="000000"/>
-          <w:sz w:val="14"/>
-          <w:szCs w:val="14"/>
-        </w:rPr>
-        <w:t xml:space="preserve">tree.insert(["Level 1-1"], parent=world)</w:t>
-      </w:r>
-    </w:p>
-    <w:p>
-      <w:pPr>
-        <w:spacing w:after="30" w:before="10"/>
-      </w:pPr>
-      <w:r>
-        <w:rPr>
-          <w:rFonts w:ascii="Calibri" w:cs="Calibri" w:eastAsia="Calibri" w:hAnsi="Calibri"/>
-          <w:sz w:val="16"/>
-          <w:szCs w:val="16"/>
-        </w:rPr>
-        <w:t xml:space="preserve">Click a heading to sort. Double-click a cell to edit: Enter saves, Tab moves on, Escape cancels.</w:t>
+        <w:t xml:space="preserve"># handle_event FIRST, draw LAST</w:t>
       </w:r>
     </w:p>
     <w:p>
@@ -2600,7 +2784,7 @@
           <w:sz w:val="20"/>
           <w:szCs w:val="20"/>
         </w:rPr>
-        <w:t xml:space="preserve">Style and themes</w:t>
+        <w:t xml:space="preserve">Table (like ttk.Treeview)</w:t>
       </w:r>
     </w:p>
     <w:p>
@@ -2618,97 +2802,151 @@
           <w:sz w:val="14"/>
           <w:szCs w:val="14"/>
         </w:rPr>
-        <w:t xml:space="preserve">style = Style()</w:t>
-      </w:r>
-    </w:p>
-    <w:p>
-      <w:pPr>
-        <w:keepNext/>
-        <w:keepLines/>
-        <w:shd w:fill="F2F4F7" w:color="auto" w:val="clear"/>
-        <w:spacing w:after="0" w:before="0" w:line="220"/>
-        <w:ind w:left="60"/>
-      </w:pPr>
-      <w:r>
-        <w:rPr>
-          <w:rFonts w:ascii="Consolas" w:cs="Consolas" w:eastAsia="Consolas" w:hAnsi="Consolas"/>
-          <w:color w:val="000000"/>
-          <w:sz w:val="14"/>
-          <w:szCs w:val="14"/>
-        </w:rPr>
-        <w:t xml:space="preserve">style.theme_use("dark")          # "light" "dark" "retro"</w:t>
-      </w:r>
-    </w:p>
-    <w:p>
-      <w:pPr>
-        <w:keepNext/>
-        <w:keepLines/>
-        <w:shd w:fill="F2F4F7" w:color="auto" w:val="clear"/>
-        <w:spacing w:after="0" w:before="0" w:line="220"/>
-        <w:ind w:left="60"/>
-      </w:pPr>
-      <w:r>
-        <w:rPr>
-          <w:rFonts w:ascii="Consolas" w:cs="Consolas" w:eastAsia="Consolas" w:hAnsi="Consolas"/>
-          <w:color w:val="000000"/>
-          <w:sz w:val="14"/>
-          <w:szCs w:val="14"/>
-        </w:rPr>
-        <w:t xml:space="preserve">style.configure("Button", border_radius=10)</w:t>
-      </w:r>
-    </w:p>
-    <w:p>
-      <w:pPr>
-        <w:keepNext/>
-        <w:keepLines/>
-        <w:shd w:fill="F2F4F7" w:color="auto" w:val="clear"/>
-        <w:spacing w:after="0" w:before="0" w:line="220"/>
-        <w:ind w:left="60"/>
-      </w:pPr>
-      <w:r>
-        <w:rPr>
-          <w:rFonts w:ascii="Consolas" w:cs="Consolas" w:eastAsia="Consolas" w:hAnsi="Consolas"/>
-          <w:color w:val="000000"/>
-          <w:sz w:val="14"/>
-          <w:szCs w:val="14"/>
-        </w:rPr>
-        <w:t xml:space="preserve">style.configure("Danger.Button", bg=(200, 0, 0))</w:t>
-      </w:r>
-    </w:p>
-    <w:p>
-      <w:pPr>
-        <w:keepNext/>
-        <w:keepLines/>
-        <w:shd w:fill="F2F4F7" w:color="auto" w:val="clear"/>
-        <w:spacing w:after="0" w:before="0" w:line="220"/>
-        <w:ind w:left="60"/>
-      </w:pPr>
-      <w:r>
-        <w:rPr>
-          <w:rFonts w:ascii="Consolas" w:cs="Consolas" w:eastAsia="Consolas" w:hAnsi="Consolas"/>
-          <w:color w:val="000000"/>
-          <w:sz w:val="14"/>
-          <w:szCs w:val="14"/>
-        </w:rPr>
-        <w:t xml:space="preserve">Button(10, 10, text="Quit", style="Danger.Button")</w:t>
-      </w:r>
-    </w:p>
-    <w:p>
-      <w:pPr>
-        <w:keepNext/>
-        <w:keepLines/>
-        <w:shd w:fill="F2F4F7" w:color="auto" w:val="clear"/>
-        <w:spacing w:after="0" w:before="0" w:line="220"/>
-        <w:ind w:left="60"/>
-      </w:pPr>
-      <w:r>
-        <w:rPr>
-          <w:rFonts w:ascii="Consolas" w:cs="Consolas" w:eastAsia="Consolas" w:hAnsi="Consolas"/>
-          <w:color w:val="000000"/>
-          <w:sz w:val="14"/>
-          <w:szCs w:val="14"/>
-        </w:rPr>
-        <w:t xml:space="preserve">Button(10, 60, 200, 50, "Play", image="button.png",</w:t>
+        <w:t xml:space="preserve">items = Table(root, columns=["Item", "Price"], rows=8,</w:t>
+      </w:r>
+    </w:p>
+    <w:p>
+      <w:pPr>
+        <w:keepNext/>
+        <w:keepLines/>
+        <w:shd w:fill="F2F4F7" w:color="auto" w:val="clear"/>
+        <w:spacing w:after="0" w:before="0" w:line="220"/>
+        <w:ind w:left="60"/>
+      </w:pPr>
+      <w:r>
+        <w:rPr>
+          <w:rFonts w:ascii="Consolas" w:cs="Consolas" w:eastAsia="Consolas" w:hAnsi="Consolas"/>
+          <w:color w:val="000000"/>
+          <w:sz w:val="14"/>
+          <w:szCs w:val="14"/>
+        </w:rPr>
+        <w:t xml:space="preserve">              editable=["Price"], on_edit=changed)</w:t>
+      </w:r>
+    </w:p>
+    <w:p>
+      <w:pPr>
+        <w:keepNext/>
+        <w:keepLines/>
+        <w:shd w:fill="F2F4F7" w:color="auto" w:val="clear"/>
+        <w:spacing w:after="0" w:before="0" w:line="220"/>
+        <w:ind w:left="60"/>
+      </w:pPr>
+      <w:r>
+        <w:rPr>
+          <w:rFonts w:ascii="Consolas" w:cs="Consolas" w:eastAsia="Consolas" w:hAnsi="Consolas"/>
+          <w:color w:val="000000"/>
+          <w:sz w:val="14"/>
+          <w:szCs w:val="14"/>
+        </w:rPr>
+        <w:t xml:space="preserve">items.column("Price", type=int, anchor="e")</w:t>
+      </w:r>
+    </w:p>
+    <w:p>
+      <w:pPr>
+        <w:keepNext/>
+        <w:keepLines/>
+        <w:shd w:fill="F2F4F7" w:color="auto" w:val="clear"/>
+        <w:spacing w:after="0" w:before="0" w:line="220"/>
+        <w:ind w:left="60"/>
+      </w:pPr>
+      <w:r>
+        <w:rPr>
+          <w:rFonts w:ascii="Consolas" w:cs="Consolas" w:eastAsia="Consolas" w:hAnsi="Consolas"/>
+          <w:color w:val="000000"/>
+          <w:sz w:val="14"/>
+          <w:szCs w:val="14"/>
+        </w:rPr>
+        <w:t xml:space="preserve">row = items.insert(["Sword", 45])</w:t>
+      </w:r>
+    </w:p>
+    <w:p>
+      <w:pPr>
+        <w:keepNext/>
+        <w:keepLines/>
+        <w:shd w:fill="F2F4F7" w:color="auto" w:val="clear"/>
+        <w:spacing w:after="0" w:before="0" w:line="220"/>
+        <w:ind w:left="60"/>
+      </w:pPr>
+      <w:r>
+        <w:rPr>
+          <w:rFonts w:ascii="Consolas" w:cs="Consolas" w:eastAsia="Consolas" w:hAnsi="Consolas"/>
+          <w:color w:val="000000"/>
+          <w:sz w:val="14"/>
+          <w:szCs w:val="14"/>
+        </w:rPr>
+        <w:t xml:space="preserve">items.get_selected()         # ["Sword", 45] or None</w:t>
+      </w:r>
+    </w:p>
+    <w:p>
+      <w:pPr>
+        <w:keepNext/>
+        <w:keepLines/>
+        <w:shd w:fill="F2F4F7" w:color="auto" w:val="clear"/>
+        <w:spacing w:after="0" w:before="0" w:line="220"/>
+        <w:ind w:left="60"/>
+      </w:pPr>
+      <w:r>
+        <w:rPr>
+          <w:rFonts w:ascii="Consolas" w:cs="Consolas" w:eastAsia="Consolas" w:hAnsi="Consolas"/>
+          <w:color w:val="000000"/>
+          <w:sz w:val="14"/>
+          <w:szCs w:val="14"/>
+        </w:rPr>
+        <w:t xml:space="preserve">items.load(list_of_rows)      items.delete(row)</w:t>
+      </w:r>
+    </w:p>
+    <w:p>
+      <w:pPr>
+        <w:keepNext/>
+        <w:keepLines/>
+        <w:shd w:fill="F2F4F7" w:color="auto" w:val="clear"/>
+        <w:spacing w:after="0" w:before="0" w:line="220"/>
+        <w:ind w:left="60"/>
+      </w:pPr>
+      <w:r>
+        <w:rPr>
+          <w:rFonts w:ascii="Consolas" w:cs="Consolas" w:eastAsia="Consolas" w:hAnsi="Consolas"/>
+          <w:color w:val="2E7D32"/>
+          <w:sz w:val="14"/>
+          <w:szCs w:val="14"/>
+        </w:rPr>
+        <w:t xml:space="preserve"># tree view: Table(..., tree=True)</w:t>
+      </w:r>
+    </w:p>
+    <w:p>
+      <w:pPr>
+        <w:keepNext/>
+        <w:keepLines/>
+        <w:shd w:fill="F2F4F7" w:color="auto" w:val="clear"/>
+        <w:spacing w:after="0" w:before="0" w:line="220"/>
+        <w:ind w:left="60"/>
+      </w:pPr>
+      <w:r>
+        <w:rPr>
+          <w:rFonts w:ascii="Consolas" w:cs="Consolas" w:eastAsia="Consolas" w:hAnsi="Consolas"/>
+          <w:color w:val="2E7D32"/>
+          <w:sz w:val="14"/>
+          <w:szCs w:val="14"/>
+        </w:rPr>
+        <w:t xml:space="preserve"># click + type like Excel: Table(..., edit_mode="spreadsheet")</w:t>
+      </w:r>
+    </w:p>
+    <w:p>
+      <w:pPr>
+        <w:keepNext/>
+        <w:keepLines/>
+        <w:shd w:fill="F2F4F7" w:color="auto" w:val="clear"/>
+        <w:spacing w:after="0" w:before="0" w:line="220"/>
+        <w:ind w:left="60"/>
+      </w:pPr>
+      <w:r>
+        <w:rPr>
+          <w:rFonts w:ascii="Consolas" w:cs="Consolas" w:eastAsia="Consolas" w:hAnsi="Consolas"/>
+          <w:color w:val="000000"/>
+          <w:sz w:val="14"/>
+          <w:szCs w:val="14"/>
+        </w:rPr>
+        <w:t xml:space="preserve">world = tree.insert(["World 1"], open=True)</w:t>
       </w:r>
     </w:p>
     <w:p>
@@ -2726,7 +2964,20 @@
           <w:sz w:val="14"/>
           <w:szCs w:val="14"/>
         </w:rPr>
-        <w:t xml:space="preserve">       hover_image="hover.png")       # image skins</w:t>
+        <w:t xml:space="preserve">tree.insert(["Level 1-1"], parent=world)</w:t>
+      </w:r>
+    </w:p>
+    <w:p>
+      <w:pPr>
+        <w:spacing w:after="30" w:before="10"/>
+      </w:pPr>
+      <w:r>
+        <w:rPr>
+          <w:rFonts w:ascii="Calibri" w:cs="Calibri" w:eastAsia="Calibri" w:hAnsi="Calibri"/>
+          <w:sz w:val="16"/>
+          <w:szCs w:val="16"/>
+        </w:rPr>
+        <w:t xml:space="preserve">Click a heading to sort. Double-click a cell to edit: Enter saves, Tab moves on, Escape cancels.</w:t>
       </w:r>
     </w:p>
     <w:p>
@@ -2743,7 +2994,7 @@
           <w:sz w:val="20"/>
           <w:szCs w:val="20"/>
         </w:rPr>
-        <w:t xml:space="preserve">Keyboard / controller menus</w:t>
+        <w:t xml:space="preserve">Style and themes</w:t>
       </w:r>
     </w:p>
     <w:p>
@@ -2761,61 +3012,97 @@
           <w:sz w:val="14"/>
           <w:szCs w:val="14"/>
         </w:rPr>
-        <w:t xml:space="preserve">focus = FocusGroup(play_button, slider, keys="arrows")</w:t>
-      </w:r>
-    </w:p>
-    <w:p>
-      <w:pPr>
-        <w:keepNext/>
-        <w:keepLines/>
-        <w:shd w:fill="F2F4F7" w:color="auto" w:val="clear"/>
-        <w:spacing w:after="0" w:before="0" w:line="220"/>
-        <w:ind w:left="60"/>
-      </w:pPr>
-      <w:r>
-        <w:rPr>
-          <w:rFonts w:ascii="Consolas" w:cs="Consolas" w:eastAsia="Consolas" w:hAnsi="Consolas"/>
-          <w:color w:val="000000"/>
-          <w:sz w:val="14"/>
-          <w:szCs w:val="14"/>
-        </w:rPr>
-        <w:t xml:space="preserve">focus.active = True         # only while the menu is open</w:t>
-      </w:r>
-    </w:p>
-    <w:p>
-      <w:pPr>
-        <w:keepNext/>
-        <w:keepLines/>
-        <w:shd w:fill="F2F4F7" w:color="auto" w:val="clear"/>
-        <w:spacing w:after="0" w:before="0" w:line="220"/>
-        <w:ind w:left="60"/>
-      </w:pPr>
-      <w:r>
-        <w:rPr>
-          <w:rFonts w:ascii="Consolas" w:cs="Consolas" w:eastAsia="Consolas" w:hAnsi="Consolas"/>
-          <w:color w:val="2E7D32"/>
-          <w:sz w:val="14"/>
-          <w:szCs w:val="14"/>
-        </w:rPr>
-        <w:t xml:space="preserve"># True = the menu used the key</w:t>
-      </w:r>
-    </w:p>
-    <w:p>
-      <w:pPr>
-        <w:keepNext/>
-        <w:keepLines/>
-        <w:shd w:fill="F2F4F7" w:color="auto" w:val="clear"/>
-        <w:spacing w:after="0" w:before="0" w:line="220"/>
-        <w:ind w:left="60"/>
-      </w:pPr>
-      <w:r>
-        <w:rPr>
-          <w:rFonts w:ascii="Consolas" w:cs="Consolas" w:eastAsia="Consolas" w:hAnsi="Consolas"/>
-          <w:color w:val="000000"/>
-          <w:sz w:val="14"/>
-          <w:szCs w:val="14"/>
-        </w:rPr>
-        <w:t xml:space="preserve">if not focus.handle_event(event):</w:t>
+        <w:t xml:space="preserve">style = Style()</w:t>
+      </w:r>
+    </w:p>
+    <w:p>
+      <w:pPr>
+        <w:keepNext/>
+        <w:keepLines/>
+        <w:shd w:fill="F2F4F7" w:color="auto" w:val="clear"/>
+        <w:spacing w:after="0" w:before="0" w:line="220"/>
+        <w:ind w:left="60"/>
+      </w:pPr>
+      <w:r>
+        <w:rPr>
+          <w:rFonts w:ascii="Consolas" w:cs="Consolas" w:eastAsia="Consolas" w:hAnsi="Consolas"/>
+          <w:color w:val="000000"/>
+          <w:sz w:val="14"/>
+          <w:szCs w:val="14"/>
+        </w:rPr>
+        <w:t xml:space="preserve">style.theme_use("dark")          # "light" "dark" "retro"</w:t>
+      </w:r>
+    </w:p>
+    <w:p>
+      <w:pPr>
+        <w:keepNext/>
+        <w:keepLines/>
+        <w:shd w:fill="F2F4F7" w:color="auto" w:val="clear"/>
+        <w:spacing w:after="0" w:before="0" w:line="220"/>
+        <w:ind w:left="60"/>
+      </w:pPr>
+      <w:r>
+        <w:rPr>
+          <w:rFonts w:ascii="Consolas" w:cs="Consolas" w:eastAsia="Consolas" w:hAnsi="Consolas"/>
+          <w:color w:val="000000"/>
+          <w:sz w:val="14"/>
+          <w:szCs w:val="14"/>
+        </w:rPr>
+        <w:t xml:space="preserve">style.configure("Button", border_radius=10)</w:t>
+      </w:r>
+    </w:p>
+    <w:p>
+      <w:pPr>
+        <w:keepNext/>
+        <w:keepLines/>
+        <w:shd w:fill="F2F4F7" w:color="auto" w:val="clear"/>
+        <w:spacing w:after="0" w:before="0" w:line="220"/>
+        <w:ind w:left="60"/>
+      </w:pPr>
+      <w:r>
+        <w:rPr>
+          <w:rFonts w:ascii="Consolas" w:cs="Consolas" w:eastAsia="Consolas" w:hAnsi="Consolas"/>
+          <w:color w:val="000000"/>
+          <w:sz w:val="14"/>
+          <w:szCs w:val="14"/>
+        </w:rPr>
+        <w:t xml:space="preserve">style.configure("Danger.Button", bg=(200, 0, 0))</w:t>
+      </w:r>
+    </w:p>
+    <w:p>
+      <w:pPr>
+        <w:keepNext/>
+        <w:keepLines/>
+        <w:shd w:fill="F2F4F7" w:color="auto" w:val="clear"/>
+        <w:spacing w:after="0" w:before="0" w:line="220"/>
+        <w:ind w:left="60"/>
+      </w:pPr>
+      <w:r>
+        <w:rPr>
+          <w:rFonts w:ascii="Consolas" w:cs="Consolas" w:eastAsia="Consolas" w:hAnsi="Consolas"/>
+          <w:color w:val="000000"/>
+          <w:sz w:val="14"/>
+          <w:szCs w:val="14"/>
+        </w:rPr>
+        <w:t xml:space="preserve">Button(10, 10, text="Quit", style="Danger.Button")</w:t>
+      </w:r>
+    </w:p>
+    <w:p>
+      <w:pPr>
+        <w:keepNext/>
+        <w:keepLines/>
+        <w:shd w:fill="F2F4F7" w:color="auto" w:val="clear"/>
+        <w:spacing w:after="0" w:before="0" w:line="220"/>
+        <w:ind w:left="60"/>
+      </w:pPr>
+      <w:r>
+        <w:rPr>
+          <w:rFonts w:ascii="Consolas" w:cs="Consolas" w:eastAsia="Consolas" w:hAnsi="Consolas"/>
+          <w:color w:val="000000"/>
+          <w:sz w:val="14"/>
+          <w:szCs w:val="14"/>
+        </w:rPr>
+        <w:t xml:space="preserve">Button(10, 60, 200, 50, "Play", image="button.png",</w:t>
       </w:r>
     </w:p>
     <w:p>
@@ -2833,7 +3120,7 @@
           <w:sz w:val="14"/>
           <w:szCs w:val="14"/>
         </w:rPr>
-        <w:t xml:space="preserve">    ...game controls...</w:t>
+        <w:t xml:space="preserve">       hover_image="hover.png")       # image skins</w:t>
       </w:r>
     </w:p>
     <w:p>
@@ -2850,6 +3137,113 @@
           <w:sz w:val="20"/>
           <w:szCs w:val="20"/>
         </w:rPr>
+        <w:t xml:space="preserve">Keyboard / controller menus</w:t>
+      </w:r>
+    </w:p>
+    <w:p>
+      <w:pPr>
+        <w:keepNext/>
+        <w:keepLines/>
+        <w:shd w:fill="F2F4F7" w:color="auto" w:val="clear"/>
+        <w:spacing w:after="0" w:before="20" w:line="220"/>
+        <w:ind w:left="60"/>
+      </w:pPr>
+      <w:r>
+        <w:rPr>
+          <w:rFonts w:ascii="Consolas" w:cs="Consolas" w:eastAsia="Consolas" w:hAnsi="Consolas"/>
+          <w:color w:val="000000"/>
+          <w:sz w:val="14"/>
+          <w:szCs w:val="14"/>
+        </w:rPr>
+        <w:t xml:space="preserve">focus = FocusGroup(play_button, slider, keys="arrows")</w:t>
+      </w:r>
+    </w:p>
+    <w:p>
+      <w:pPr>
+        <w:keepNext/>
+        <w:keepLines/>
+        <w:shd w:fill="F2F4F7" w:color="auto" w:val="clear"/>
+        <w:spacing w:after="0" w:before="0" w:line="220"/>
+        <w:ind w:left="60"/>
+      </w:pPr>
+      <w:r>
+        <w:rPr>
+          <w:rFonts w:ascii="Consolas" w:cs="Consolas" w:eastAsia="Consolas" w:hAnsi="Consolas"/>
+          <w:color w:val="000000"/>
+          <w:sz w:val="14"/>
+          <w:szCs w:val="14"/>
+        </w:rPr>
+        <w:t xml:space="preserve">focus.active = True         # only while the menu is open</w:t>
+      </w:r>
+    </w:p>
+    <w:p>
+      <w:pPr>
+        <w:keepNext/>
+        <w:keepLines/>
+        <w:shd w:fill="F2F4F7" w:color="auto" w:val="clear"/>
+        <w:spacing w:after="0" w:before="0" w:line="220"/>
+        <w:ind w:left="60"/>
+      </w:pPr>
+      <w:r>
+        <w:rPr>
+          <w:rFonts w:ascii="Consolas" w:cs="Consolas" w:eastAsia="Consolas" w:hAnsi="Consolas"/>
+          <w:color w:val="2E7D32"/>
+          <w:sz w:val="14"/>
+          <w:szCs w:val="14"/>
+        </w:rPr>
+        <w:t xml:space="preserve"># True = the menu used the key</w:t>
+      </w:r>
+    </w:p>
+    <w:p>
+      <w:pPr>
+        <w:keepNext/>
+        <w:keepLines/>
+        <w:shd w:fill="F2F4F7" w:color="auto" w:val="clear"/>
+        <w:spacing w:after="0" w:before="0" w:line="220"/>
+        <w:ind w:left="60"/>
+      </w:pPr>
+      <w:r>
+        <w:rPr>
+          <w:rFonts w:ascii="Consolas" w:cs="Consolas" w:eastAsia="Consolas" w:hAnsi="Consolas"/>
+          <w:color w:val="000000"/>
+          <w:sz w:val="14"/>
+          <w:szCs w:val="14"/>
+        </w:rPr>
+        <w:t xml:space="preserve">if not focus.handle_event(event):</w:t>
+      </w:r>
+    </w:p>
+    <w:p>
+      <w:pPr>
+        <w:keepNext w:val="false"/>
+        <w:keepLines/>
+        <w:shd w:fill="F2F4F7" w:color="auto" w:val="clear"/>
+        <w:spacing w:after="40" w:before="0" w:line="220"/>
+        <w:ind w:left="60"/>
+      </w:pPr>
+      <w:r>
+        <w:rPr>
+          <w:rFonts w:ascii="Consolas" w:cs="Consolas" w:eastAsia="Consolas" w:hAnsi="Consolas"/>
+          <w:color w:val="000000"/>
+          <w:sz w:val="14"/>
+          <w:szCs w:val="14"/>
+        </w:rPr>
+        <w:t xml:space="preserve">    ...game controls...</w:t>
+      </w:r>
+    </w:p>
+    <w:p>
+      <w:pPr>
+        <w:keepNext/>
+        <w:spacing w:after="30" w:before="100"/>
+      </w:pPr>
+      <w:r>
+        <w:rPr>
+          <w:rFonts w:ascii="Calibri" w:cs="Calibri" w:eastAsia="Calibri" w:hAnsi="Calibri"/>
+          <w:b/>
+          <w:bCs/>
+          <w:color w:val="1F4E79"/>
+          <w:sz w:val="20"/>
+          <w:szCs w:val="20"/>
+        </w:rPr>
         <w:t xml:space="preserve">Tooltips</w:t>
       </w:r>
     </w:p>
@@ -4596,6 +4990,24 @@
           <w:szCs w:val="14"/>
         </w:rPr>
         <w:t xml:space="preserve">world.update(tick)          world.draw(screen)</w:t>
+      </w:r>
+    </w:p>
+    <w:p>
+      <w:pPr>
+        <w:keepNext/>
+        <w:keepLines/>
+        <w:shd w:fill="F2F4F7" w:color="auto" w:val="clear"/>
+        <w:spacing w:after="0" w:before="0" w:line="220"/>
+        <w:ind w:left="60"/>
+      </w:pPr>
+      <w:r>
+        <w:rPr>
+          <w:rFonts w:ascii="Consolas" w:cs="Consolas" w:eastAsia="Consolas" w:hAnsi="Consolas"/>
+          <w:color w:val="2E7D32"/>
+          <w:sz w:val="14"/>
+          <w:szCs w:val="14"/>
+        </w:rPr>
+        <w:t xml:space="preserve"># big maps: only on-screen tiles are drawn. F1 = FPS</w:t>
       </w:r>
     </w:p>
     <w:p>

</xml_diff>

<commit_message>
Added Floating Text Particle Effect
</commit_message>
<xml_diff>
--- a/docs/PygameTkinterGUITools_CheatSheet.docx
+++ b/docs/PygameTkinterGUITools_CheatSheet.docx
@@ -5776,7 +5776,7 @@
           <w:sz w:val="20"/>
           <w:szCs w:val="20"/>
         </w:rPr>
-        <w:t xml:space="preserve">Particles and chains</w:t>
+        <w:t xml:space="preserve">Particles, floating text and chains</w:t>
       </w:r>
     </w:p>
     <w:p>
@@ -5831,6 +5831,42 @@
           <w:szCs w:val="14"/>
         </w:rPr>
         <w:t xml:space="preserve">Particles.update(tick)    Particles.draw(screen)</w:t>
+      </w:r>
+    </w:p>
+    <w:p>
+      <w:pPr>
+        <w:keepNext/>
+        <w:keepLines/>
+        <w:shd w:fill="F2F4F7" w:color="auto" w:val="clear"/>
+        <w:spacing w:after="0" w:before="0" w:line="220"/>
+        <w:ind w:left="60"/>
+      </w:pPr>
+      <w:r>
+        <w:rPr>
+          <w:rFonts w:ascii="Consolas" w:cs="Consolas" w:eastAsia="Consolas" w:hAnsi="Consolas"/>
+          <w:color w:val="000000"/>
+          <w:sz w:val="14"/>
+          <w:szCs w:val="14"/>
+        </w:rPr>
+        <w:t xml:space="preserve">FloatingText(x, y, "-10", color="red")   # "+10" pop-ups</w:t>
+      </w:r>
+    </w:p>
+    <w:p>
+      <w:pPr>
+        <w:keepNext/>
+        <w:keepLines/>
+        <w:shd w:fill="F2F4F7" w:color="auto" w:val="clear"/>
+        <w:spacing w:after="0" w:before="0" w:line="220"/>
+        <w:ind w:left="60"/>
+      </w:pPr>
+      <w:r>
+        <w:rPr>
+          <w:rFonts w:ascii="Consolas" w:cs="Consolas" w:eastAsia="Consolas" w:hAnsi="Consolas"/>
+          <w:color w:val="2E7D32"/>
+          <w:sz w:val="14"/>
+          <w:szCs w:val="14"/>
+        </w:rPr>
+        <w:t xml:space="preserve"># a text particle: needs the 2 Particles lines above</w:t>
       </w:r>
     </w:p>
     <w:p>

</xml_diff>

<commit_message>
Added Complex HeartBar and minor overall improvements
</commit_message>
<xml_diff>
--- a/docs/PygameTkinterGUITools_CheatSheet.docx
+++ b/docs/PygameTkinterGUITools_CheatSheet.docx
@@ -1458,6 +1458,204 @@
     </w:p>
     <w:p>
       <w:pPr>
+        <w:keepNext/>
+        <w:keepLines/>
+        <w:shd w:fill="F2F4F7" w:color="auto" w:val="clear"/>
+        <w:spacing w:after="0" w:before="0" w:line="220"/>
+        <w:ind w:left="60"/>
+      </w:pPr>
+      <w:r>
+        <w:rPr>
+          <w:rFonts w:ascii="Consolas" w:cs="Consolas" w:eastAsia="Consolas" w:hAnsi="Consolas"/>
+          <w:color w:val="000000"/>
+          <w:sz w:val="14"/>
+          <w:szCs w:val="14"/>
+        </w:rPr>
+        <w:t>Progressbar(..., low_color=(220, 50, 50), animate=True)</w:t>
+      </w:r>
+    </w:p>
+    <w:p>
+      <w:pPr>
+        <w:keepNext/>
+        <w:keepLines/>
+        <w:shd w:fill="F2F4F7" w:color="auto" w:val="clear"/>
+        <w:spacing w:after="0" w:before="0" w:line="220"/>
+        <w:ind w:left="60"/>
+      </w:pPr>
+      <w:r>
+        <w:rPr>
+          <w:rFonts w:ascii="Consolas" w:cs="Consolas" w:eastAsia="Consolas" w:hAnsi="Consolas"/>
+          <w:color w:val="000000"/>
+          <w:sz w:val="14"/>
+          <w:szCs w:val="14"/>
+        </w:rPr>
+        <w:t>TextBox(20, 130, show="*", placeholder="Password",</w:t>
+      </w:r>
+    </w:p>
+    <w:p>
+      <w:pPr>
+        <w:keepNext/>
+        <w:keepLines/>
+        <w:shd w:fill="F2F4F7" w:color="auto" w:val="clear"/>
+        <w:spacing w:after="0" w:before="0" w:line="220"/>
+        <w:ind w:left="60"/>
+      </w:pPr>
+      <w:r>
+        <w:rPr>
+          <w:rFonts w:ascii="Consolas" w:cs="Consolas" w:eastAsia="Consolas" w:hAnsi="Consolas"/>
+          <w:color w:val="000000"/>
+          <w:sz w:val="14"/>
+          <w:szCs w:val="14"/>
+        </w:rPr>
+        <w:t xml:space="preserve">        allowed="digits", on_change=check)  # or "letters"</w:t>
+      </w:r>
+    </w:p>
+    <w:p>
+      <w:pPr>
+        <w:keepNext/>
+        <w:keepLines/>
+        <w:shd w:fill="F2F4F7" w:color="auto" w:val="clear"/>
+        <w:spacing w:after="0" w:before="0" w:line="220"/>
+        <w:ind w:left="60"/>
+      </w:pPr>
+      <w:r>
+        <w:rPr>
+          <w:rFonts w:ascii="Consolas" w:cs="Consolas" w:eastAsia="Consolas" w:hAnsi="Consolas"/>
+          <w:color w:val="000000"/>
+          <w:sz w:val="14"/>
+          <w:szCs w:val="14"/>
+        </w:rPr>
+        <w:t>Label(20, 20, "Level 1", outline=2, shadow=True)</w:t>
+      </w:r>
+    </w:p>
+    <w:p>
+      <w:pPr>
+        <w:keepNext/>
+        <w:keepLines/>
+        <w:shd w:fill="F2F4F7" w:color="auto" w:val="clear"/>
+        <w:spacing w:after="0" w:before="0" w:line="220"/>
+        <w:ind w:left="60"/>
+      </w:pPr>
+      <w:r>
+        <w:rPr>
+          <w:rFonts w:ascii="Consolas" w:cs="Consolas" w:eastAsia="Consolas" w:hAnsi="Consolas"/>
+          <w:color w:val="000000"/>
+          <w:sz w:val="14"/>
+          <w:szCs w:val="14"/>
+        </w:rPr>
+        <w:t>Label(20, 60, "Line 1\nLine 2", justify="center")</w:t>
+      </w:r>
+    </w:p>
+    <w:p>
+      <w:pPr>
+        <w:keepNext/>
+        <w:keepLines/>
+        <w:shd w:fill="F2F4F7" w:color="auto" w:val="clear"/>
+        <w:spacing w:after="0" w:before="0" w:line="220"/>
+        <w:ind w:left="60"/>
+      </w:pPr>
+      <w:r>
+        <w:rPr>
+          <w:rFonts w:ascii="Consolas" w:cs="Consolas" w:eastAsia="Consolas" w:hAnsi="Consolas"/>
+          <w:color w:val="000000"/>
+          <w:sz w:val="14"/>
+          <w:szCs w:val="14"/>
+        </w:rPr>
+        <w:t>Button(20, 60, text="+", active_bg=(0, 90, 200),</w:t>
+      </w:r>
+    </w:p>
+    <w:p>
+      <w:pPr>
+        <w:keepNext/>
+        <w:keepLines/>
+        <w:shd w:fill="F2F4F7" w:color="auto" w:val="clear"/>
+        <w:spacing w:after="0" w:before="0" w:line="220"/>
+        <w:ind w:left="60"/>
+      </w:pPr>
+      <w:r>
+        <w:rPr>
+          <w:rFonts w:ascii="Consolas" w:cs="Consolas" w:eastAsia="Consolas" w:hAnsi="Consolas"/>
+          <w:color w:val="000000"/>
+          <w:sz w:val="14"/>
+          <w:szCs w:val="14"/>
+        </w:rPr>
+        <w:t xml:space="preserve">       sound="click.wav", repeatdelay=400, repeatinterval=80)</w:t>
+      </w:r>
+    </w:p>
+    <w:p>
+      <w:pPr>
+        <w:keepNext/>
+        <w:keepLines/>
+        <w:shd w:fill="F2F4F7" w:color="auto" w:val="clear"/>
+        <w:spacing w:after="0" w:before="0" w:line="220"/>
+        <w:ind w:left="60"/>
+      </w:pPr>
+      <w:r>
+        <w:rPr>
+          <w:rFonts w:ascii="Consolas" w:cs="Consolas" w:eastAsia="Consolas" w:hAnsi="Consolas"/>
+          <w:color w:val="000000"/>
+          <w:sz w:val="14"/>
+          <w:szCs w:val="14"/>
+        </w:rPr>
+        <w:t>Listbox(20, 340, 200, selectmode="multiple")  # several</w:t>
+      </w:r>
+    </w:p>
+    <w:p>
+      <w:pPr>
+        <w:keepNext/>
+        <w:keepLines/>
+        <w:shd w:fill="F2F4F7" w:color="auto" w:val="clear"/>
+        <w:spacing w:after="0" w:before="0" w:line="220"/>
+        <w:ind w:left="60"/>
+      </w:pPr>
+      <w:r>
+        <w:rPr>
+          <w:rFonts w:ascii="Consolas" w:cs="Consolas" w:eastAsia="Consolas" w:hAnsi="Consolas"/>
+          <w:color w:val="000000"/>
+          <w:sz w:val="14"/>
+          <w:szCs w:val="14"/>
+        </w:rPr>
+        <w:t>Combobox(250, 20, 200, values=names, editable=True)  # search</w:t>
+      </w:r>
+    </w:p>
+    <w:p>
+      <w:pPr>
+        <w:keepNext/>
+        <w:keepLines/>
+        <w:shd w:fill="F2F4F7" w:color="auto" w:val="clear"/>
+        <w:spacing w:after="0" w:before="0" w:line="220"/>
+        <w:ind w:left="60"/>
+      </w:pPr>
+      <w:r>
+        <w:rPr>
+          <w:rFonts w:ascii="Consolas" w:cs="Consolas" w:eastAsia="Consolas" w:hAnsi="Consolas"/>
+          <w:color w:val="000000"/>
+          <w:sz w:val="14"/>
+          <w:szCs w:val="14"/>
+        </w:rPr>
+        <w:t>askstring("Name", "Your name?", command=got_name)  # typing box</w:t>
+      </w:r>
+    </w:p>
+    <w:p>
+      <w:pPr>
+        <w:keepNext/>
+        <w:keepLines/>
+        <w:shd w:fill="F2F4F7" w:color="auto" w:val="clear"/>
+        <w:spacing w:after="0" w:before="0" w:line="220"/>
+        <w:ind w:left="60"/>
+      </w:pPr>
+      <w:r>
+        <w:rPr>
+          <w:rFonts w:ascii="Consolas" w:cs="Consolas" w:eastAsia="Consolas" w:hAnsi="Consolas"/>
+          <w:color w:val="2E7D32"/>
+          <w:sz w:val="14"/>
+          <w:szCs w:val="14"/>
+        </w:rPr>
+        <w:t># askinteger(..., minvalue=1, maxvalue=99) gives an int</w:t>
+      </w:r>
+    </w:p>
+    <w:p>
+      <w:pPr>
         <w:keepNext w:val="false"/>
         <w:keepLines/>
         <w:shd w:fill="F2F4F7" w:color="auto" w:val="clear"/>
@@ -1537,6 +1735,42 @@
           <w:szCs w:val="14"/>
         </w:rPr>
         <w:t xml:space="preserve">name = name_box.get()                    # read a TextBox</w:t>
+      </w:r>
+    </w:p>
+    <w:p>
+      <w:pPr>
+        <w:keepNext/>
+        <w:keepLines/>
+        <w:shd w:fill="F2F4F7" w:color="auto" w:val="clear"/>
+        <w:spacing w:after="0" w:before="0" w:line="220"/>
+        <w:ind w:left="60"/>
+      </w:pPr>
+      <w:r>
+        <w:rPr>
+          <w:rFonts w:ascii="Consolas" w:cs="Consolas" w:eastAsia="Consolas" w:hAnsi="Consolas"/>
+          <w:color w:val="000000"/>
+          <w:sz w:val="14"/>
+          <w:szCs w:val="14"/>
+        </w:rPr>
+        <w:t>menu.show(fade_ms=300)   menu.hide(fade_ms=300)  # fade</w:t>
+      </w:r>
+    </w:p>
+    <w:p>
+      <w:pPr>
+        <w:keepNext/>
+        <w:keepLines/>
+        <w:shd w:fill="F2F4F7" w:color="auto" w:val="clear"/>
+        <w:spacing w:after="0" w:before="0" w:line="220"/>
+        <w:ind w:left="60"/>
+      </w:pPr>
+      <w:r>
+        <w:rPr>
+          <w:rFonts w:ascii="Consolas" w:cs="Consolas" w:eastAsia="Consolas" w:hAnsi="Consolas"/>
+          <w:color w:val="000000"/>
+          <w:sz w:val="14"/>
+          <w:szCs w:val="14"/>
+        </w:rPr>
+        <w:t>title.slide_to(300, 90, ms=500)          # glide to x, y</w:t>
       </w:r>
     </w:p>
     <w:p>
@@ -2480,7 +2714,7 @@
           <w:sz w:val="14"/>
           <w:szCs w:val="14"/>
         </w:rPr>
-        <w:t xml:space="preserve"># also askyesno askokcancel showinfo, or your own:</w:t>
+        <w:t># also askyesno askokcancel showinfo askstring, or:</w:t>
       </w:r>
     </w:p>
     <w:p>
@@ -3030,7 +3264,7 @@
           <w:sz w:val="14"/>
           <w:szCs w:val="14"/>
         </w:rPr>
-        <w:t xml:space="preserve">style.theme_use("dark")          # "light" "dark" "retro"</w:t>
+        <w:t>style.theme_use("dark")          # "retro" "high_contrast"</w:t>
       </w:r>
     </w:p>
     <w:p>
@@ -5634,6 +5868,60 @@
           <w:szCs w:val="14"/>
         </w:rPr>
         <w:t xml:space="preserve">player.health.damage(10)</w:t>
+      </w:r>
+    </w:p>
+    <w:p>
+      <w:pPr>
+        <w:keepNext/>
+        <w:keepLines/>
+        <w:shd w:fill="F2F4F7" w:color="auto" w:val="clear"/>
+        <w:spacing w:after="0" w:before="0" w:line="220"/>
+        <w:ind w:left="60"/>
+      </w:pPr>
+      <w:r>
+        <w:rPr>
+          <w:rFonts w:ascii="Consolas" w:cs="Consolas" w:eastAsia="Consolas" w:hAnsi="Consolas"/>
+          <w:color w:val="000000"/>
+          <w:sz w:val="14"/>
+          <w:szCs w:val="14"/>
+        </w:rPr>
+        <w:t>enemy.health.draw_bar(screen, enemy, camera)  # bar above</w:t>
+      </w:r>
+    </w:p>
+    <w:p>
+      <w:pPr>
+        <w:keepNext/>
+        <w:keepLines/>
+        <w:shd w:fill="F2F4F7" w:color="auto" w:val="clear"/>
+        <w:spacing w:after="0" w:before="0" w:line="220"/>
+        <w:ind w:left="60"/>
+      </w:pPr>
+      <w:r>
+        <w:rPr>
+          <w:rFonts w:ascii="Consolas" w:cs="Consolas" w:eastAsia="Consolas" w:hAnsi="Consolas"/>
+          <w:color w:val="000000"/>
+          <w:sz w:val="14"/>
+          <w:szCs w:val="14"/>
+        </w:rPr>
+        <w:t xml:space="preserve">hearts = HeartsBar(20, 20, health=player.health, hearts=5)</w:t>
+      </w:r>
+    </w:p>
+    <w:p>
+      <w:pPr>
+        <w:keepNext/>
+        <w:keepLines/>
+        <w:shd w:fill="F2F4F7" w:color="auto" w:val="clear"/>
+        <w:spacing w:after="0" w:before="0" w:line="220"/>
+        <w:ind w:left="60"/>
+      </w:pPr>
+      <w:r>
+        <w:rPr>
+          <w:rFonts w:ascii="Consolas" w:cs="Consolas" w:eastAsia="Consolas" w:hAnsi="Consolas"/>
+          <w:color w:val="000000"/>
+          <w:sz w:val="14"/>
+          <w:szCs w:val="14"/>
+        </w:rPr>
+        <w:t xml:space="preserve"># 20 HP a heart, half hearts; full_image= for pictures</w:t>
       </w:r>
     </w:p>
     <w:p>
@@ -6054,6 +6342,19 @@
       <w:instrText xml:space="preserve">PAGE</w:instrText>
       <w:fldChar w:fldCharType="separate"/>
       <w:fldChar w:fldCharType="end"/>
+    </w:r>
+  </w:p>
+  <w:p>
+    <w:pPr>
+      <w:jc w:val="center"/>
+    </w:pPr>
+    <w:r>
+      <w:rPr>
+        <w:color w:val="777777"/>
+        <w:sz w:val="14"/>
+        <w:szCs w:val="14"/>
+      </w:rPr>
+      <w:t>© 2026 State of Victoria (Department of Education). Written by Adam Fox, Greater Shepparton Secondary College. CC BY 4.0 creativecommons.org/licenses/by/4.0</w:t>
     </w:r>
   </w:p>
 </w:ftr>

</xml_diff>

<commit_message>
Added Improvements to Animator and Sprite Object.
</commit_message>
<xml_diff>
--- a/docs/PygameTkinterGUITools_CheatSheet.docx
+++ b/docs/PygameTkinterGUITools_CheatSheet.docx
@@ -4864,6 +4864,96 @@
           <w:sz w:val="14"/>
           <w:szCs w:val="14"/>
         </w:rPr>
+        <w:t xml:space="preserve">player.point_at(pg.mouse.get_pos())   # turn to face it</w:t>
+      </w:r>
+    </w:p>
+    <w:p>
+      <w:pPr>
+        <w:keepNext/>
+        <w:keepLines/>
+        <w:shd w:fill="F2F4F7" w:color="auto" w:val="clear"/>
+        <w:spacing w:after="0" w:before="0" w:line="220"/>
+        <w:ind w:left="60"/>
+      </w:pPr>
+      <w:r>
+        <w:rPr>
+          <w:rFonts w:ascii="Consolas" w:cs="Consolas" w:eastAsia="Consolas" w:hAnsi="Consolas"/>
+          <w:color w:val="000000"/>
+          <w:sz w:val="14"/>
+          <w:szCs w:val="14"/>
+        </w:rPr>
+        <w:t xml:space="preserve">player.angle = 90    # 0 up, 90 right (clockwise)</w:t>
+      </w:r>
+    </w:p>
+    <w:p>
+      <w:pPr>
+        <w:keepNext/>
+        <w:keepLines/>
+        <w:shd w:fill="F2F4F7" w:color="auto" w:val="clear"/>
+        <w:spacing w:after="0" w:before="0" w:line="220"/>
+        <w:ind w:left="60"/>
+      </w:pPr>
+      <w:r>
+        <w:rPr>
+          <w:rFonts w:ascii="Consolas" w:cs="Consolas" w:eastAsia="Consolas" w:hAnsi="Consolas"/>
+          <w:color w:val="000000"/>
+          <w:sz w:val="14"/>
+          <w:szCs w:val="14"/>
+        </w:rPr>
+        <w:t xml:space="preserve">coin = player.collides_with_any(coins, pixel=True)</w:t>
+      </w:r>
+    </w:p>
+    <w:p>
+      <w:pPr>
+        <w:keepNext/>
+        <w:keepLines/>
+        <w:shd w:fill="F2F4F7" w:color="auto" w:val="clear"/>
+        <w:spacing w:after="0" w:before="0" w:line="220"/>
+        <w:ind w:left="60"/>
+      </w:pPr>
+      <w:r>
+        <w:rPr>
+          <w:rFonts w:ascii="Consolas" w:cs="Consolas" w:eastAsia="Consolas" w:hAnsi="Consolas"/>
+          <w:color w:val="000000"/>
+          <w:sz w:val="14"/>
+          <w:szCs w:val="14"/>
+        </w:rPr>
+        <w:t xml:space="preserve">enemy.distance_to(player)   enemy.direction_to(player)</w:t>
+      </w:r>
+    </w:p>
+    <w:p>
+      <w:pPr>
+        <w:keepNext/>
+        <w:keepLines/>
+        <w:shd w:fill="F2F4F7" w:color="auto" w:val="clear"/>
+        <w:spacing w:after="0" w:before="0" w:line="220"/>
+        <w:ind w:left="60"/>
+      </w:pPr>
+      <w:r>
+        <w:rPr>
+          <w:rFonts w:ascii="Consolas" w:cs="Consolas" w:eastAsia="Consolas" w:hAnsi="Consolas"/>
+          <w:color w:val="2E7D32"/>
+          <w:sz w:val="14"/>
+          <w:szCs w:val="14"/>
+        </w:rPr>
+        <w:t xml:space="preserve"># smooth_move=True: move(0.4, 0) still moves</w:t>
+      </w:r>
+    </w:p>
+    <w:p>
+      <w:pPr>
+        <w:keepNext/>
+        <w:keepLines/>
+        <w:shd w:fill="F2F4F7" w:color="auto" w:val="clear"/>
+        <w:spacing w:after="0" w:before="0" w:line="220"/>
+        <w:ind w:left="60"/>
+      </w:pPr>
+      <w:r>
+        <w:rPr>
+          <w:rFonts w:ascii="Consolas" w:cs="Consolas" w:eastAsia="Consolas" w:hAnsi="Consolas"/>
+          <w:color w:val="000000"/>
+          <w:sz w:val="14"/>
+          <w:szCs w:val="14"/>
+        </w:rPr>
         <w:t xml:space="preserve"> </w:t>
       </w:r>
     </w:p>
@@ -4973,6 +5063,60 @@
           <w:szCs w:val="14"/>
         </w:rPr>
         <w:t xml:space="preserve">anim.play("walk")      anim.play_once("jump")</w:t>
+      </w:r>
+    </w:p>
+    <w:p>
+      <w:pPr>
+        <w:keepNext/>
+        <w:keepLines/>
+        <w:shd w:fill="F2F4F7" w:color="auto" w:val="clear"/>
+        <w:spacing w:after="0" w:before="0" w:line="220"/>
+        <w:ind w:left="60"/>
+      </w:pPr>
+      <w:r>
+        <w:rPr>
+          <w:rFonts w:ascii="Consolas" w:cs="Consolas" w:eastAsia="Consolas" w:hAnsi="Consolas"/>
+          <w:color w:val="000000"/>
+          <w:sz w:val="14"/>
+          <w:szCs w:val="14"/>
+        </w:rPr>
+        <w:t xml:space="preserve">anim.play_once("attack", then="idle")   anim.busy</w:t>
+      </w:r>
+    </w:p>
+    <w:p>
+      <w:pPr>
+        <w:keepNext/>
+        <w:keepLines/>
+        <w:shd w:fill="F2F4F7" w:color="auto" w:val="clear"/>
+        <w:spacing w:after="0" w:before="0" w:line="220"/>
+        <w:ind w:left="60"/>
+      </w:pPr>
+      <w:r>
+        <w:rPr>
+          <w:rFonts w:ascii="Consolas" w:cs="Consolas" w:eastAsia="Consolas" w:hAnsi="Consolas"/>
+          <w:color w:val="000000"/>
+          <w:sz w:val="14"/>
+          <w:szCs w:val="14"/>
+        </w:rPr>
+        <w:t xml:space="preserve">anim.on_frame("walk", 1, step.play)  # frame 1 of walk</w:t>
+      </w:r>
+    </w:p>
+    <w:p>
+      <w:pPr>
+        <w:keepNext/>
+        <w:keepLines/>
+        <w:shd w:fill="F2F4F7" w:color="auto" w:val="clear"/>
+        <w:spacing w:after="0" w:before="0" w:line="220"/>
+        <w:ind w:left="60"/>
+      </w:pPr>
+      <w:r>
+        <w:rPr>
+          <w:rFonts w:ascii="Consolas" w:cs="Consolas" w:eastAsia="Consolas" w:hAnsi="Consolas"/>
+          <w:color w:val="2E7D32"/>
+          <w:sz w:val="14"/>
+          <w:szCs w:val="14"/>
+        </w:rPr>
+        <w:t xml:space="preserve"># add_animation(..., frame_rate=16) = a faster one</w:t>
       </w:r>
     </w:p>
     <w:p>

</xml_diff>

<commit_message>
Adjusted Colision mechanics for Tile Layer Depth
</commit_message>
<xml_diff>
--- a/docs/PygameTkinterGUITools_CheatSheet.docx
+++ b/docs/PygameTkinterGUITools_CheatSheet.docx
@@ -5331,25 +5331,79 @@
           <w:sz w:val="14"/>
           <w:szCs w:val="14"/>
         </w:rPr>
-        <w:t xml:space="preserve">world = World(level, camera)</w:t>
-      </w:r>
-    </w:p>
-    <w:p>
-      <w:pPr>
-        <w:keepNext/>
-        <w:keepLines/>
-        <w:shd w:fill="F2F4F7" w:color="auto" w:val="clear"/>
-        <w:spacing w:after="0" w:before="0" w:line="220"/>
-        <w:ind w:left="60"/>
-      </w:pPr>
-      <w:r>
-        <w:rPr>
-          <w:rFonts w:ascii="Consolas" w:cs="Consolas" w:eastAsia="Consolas" w:hAnsi="Consolas"/>
-          <w:color w:val="000000"/>
-          <w:sz w:val="14"/>
-          <w:szCs w:val="14"/>
-        </w:rPr>
-        <w:t xml:space="preserve">world.add_sprite(player)</w:t>
+        <w:t xml:space="preserve">camera.snap()        # start on the player (no glide)</w:t>
+      </w:r>
+    </w:p>
+    <w:p>
+      <w:pPr>
+        <w:keepNext/>
+        <w:keepLines/>
+        <w:shd w:fill="F2F4F7" w:color="auto" w:val="clear"/>
+        <w:spacing w:after="0" w:before="0" w:line="220"/>
+        <w:ind w:left="60"/>
+      </w:pPr>
+      <w:r>
+        <w:rPr>
+          <w:rFonts w:ascii="Consolas" w:cs="Consolas" w:eastAsia="Consolas" w:hAnsi="Consolas"/>
+          <w:color w:val="000000"/>
+          <w:sz w:val="14"/>
+          <w:szCs w:val="14"/>
+        </w:rPr>
+        <w:t xml:space="preserve">camera = Camera(..., deadzone=(200, 120), lookahead=100)</w:t>
+      </w:r>
+    </w:p>
+    <w:p>
+      <w:pPr>
+        <w:keepNext/>
+        <w:keepLines/>
+        <w:shd w:fill="F2F4F7" w:color="auto" w:val="clear"/>
+        <w:spacing w:after="0" w:before="0" w:line="220"/>
+        <w:ind w:left="60"/>
+      </w:pPr>
+      <w:r>
+        <w:rPr>
+          <w:rFonts w:ascii="Consolas" w:cs="Consolas" w:eastAsia="Consolas" w:hAnsi="Consolas"/>
+          <w:color w:val="2E7D32"/>
+          <w:sz w:val="14"/>
+          <w:szCs w:val="14"/>
+        </w:rPr>
+        <w:t xml:space="preserve"># deadzone: walk in a box first. lookahead: see ahead</w:t>
+      </w:r>
+    </w:p>
+    <w:p>
+      <w:pPr>
+        <w:keepNext/>
+        <w:keepLines/>
+        <w:shd w:fill="F2F4F7" w:color="auto" w:val="clear"/>
+        <w:spacing w:after="0" w:before="0" w:line="220"/>
+        <w:ind w:left="60"/>
+      </w:pPr>
+      <w:r>
+        <w:rPr>
+          <w:rFonts w:ascii="Consolas" w:cs="Consolas" w:eastAsia="Consolas" w:hAnsi="Consolas"/>
+          <w:color w:val="000000"/>
+          <w:sz w:val="14"/>
+          <w:szCs w:val="14"/>
+        </w:rPr>
+        <w:t xml:space="preserve">if camera.on_screen(enemy, margin=100):  enemy.update(tick)</w:t>
+      </w:r>
+    </w:p>
+    <w:p>
+      <w:pPr>
+        <w:keepNext/>
+        <w:keepLines/>
+        <w:shd w:fill="F2F4F7" w:color="auto" w:val="clear"/>
+        <w:spacing w:after="0" w:before="0" w:line="220"/>
+        <w:ind w:left="60"/>
+      </w:pPr>
+      <w:r>
+        <w:rPr>
+          <w:rFonts w:ascii="Consolas" w:cs="Consolas" w:eastAsia="Consolas" w:hAnsi="Consolas"/>
+          <w:color w:val="000000"/>
+          <w:sz w:val="14"/>
+          <w:szCs w:val="14"/>
+        </w:rPr>
+        <w:t xml:space="preserve">world = World(level, camera)   world.add_sprite(player)</w:t>
       </w:r>
     </w:p>
     <w:p>
@@ -5368,6 +5422,114 @@
           <w:szCs w:val="14"/>
         </w:rPr>
         <w:t xml:space="preserve">world.update(tick)          world.draw(screen)</w:t>
+      </w:r>
+    </w:p>
+    <w:p>
+      <w:pPr>
+        <w:keepNext/>
+        <w:keepLines/>
+        <w:shd w:fill="F2F4F7" w:color="auto" w:val="clear"/>
+        <w:spacing w:after="0" w:before="0" w:line="220"/>
+        <w:ind w:left="60"/>
+      </w:pPr>
+      <w:r>
+        <w:rPr>
+          <w:rFonts w:ascii="Consolas" w:cs="Consolas" w:eastAsia="Consolas" w:hAnsi="Consolas"/>
+          <w:color w:val="000000"/>
+          <w:sz w:val="14"/>
+          <w:szCs w:val="14"/>
+        </w:rPr>
+        <w:t xml:space="preserve">world = World(level, camera, y_sort=True)  # lower = in front</w:t>
+      </w:r>
+    </w:p>
+    <w:p>
+      <w:pPr>
+        <w:keepNext/>
+        <w:keepLines/>
+        <w:shd w:fill="F2F4F7" w:color="auto" w:val="clear"/>
+        <w:spacing w:after="0" w:before="0" w:line="220"/>
+        <w:ind w:left="60"/>
+      </w:pPr>
+      <w:r>
+        <w:rPr>
+          <w:rFonts w:ascii="Consolas" w:cs="Consolas" w:eastAsia="Consolas" w:hAnsi="Consolas"/>
+          <w:color w:val="2E7D32"/>
+          <w:sz w:val="14"/>
+          <w:szCs w:val="14"/>
+        </w:rPr>
+        <w:t xml:space="preserve"># layer names: (any) / "midground" / "foreground"</w:t>
+      </w:r>
+    </w:p>
+    <w:p>
+      <w:pPr>
+        <w:keepNext/>
+        <w:keepLines/>
+        <w:shd w:fill="F2F4F7" w:color="auto" w:val="clear"/>
+        <w:spacing w:after="0" w:before="0" w:line="220"/>
+        <w:ind w:left="60"/>
+      </w:pPr>
+      <w:r>
+        <w:rPr>
+          <w:rFonts w:ascii="Consolas" w:cs="Consolas" w:eastAsia="Consolas" w:hAnsi="Consolas"/>
+          <w:color w:val="000000"/>
+          <w:sz w:val="14"/>
+          <w:szCs w:val="14"/>
+        </w:rPr>
+        <w:t xml:space="preserve">ground = level.tile_properties_at(player.rect.midbottom)</w:t>
+      </w:r>
+    </w:p>
+    <w:p>
+      <w:pPr>
+        <w:keepNext/>
+        <w:keepLines/>
+        <w:shd w:fill="F2F4F7" w:color="auto" w:val="clear"/>
+        <w:spacing w:after="0" w:before="0" w:line="220"/>
+        <w:ind w:left="60"/>
+      </w:pPr>
+      <w:r>
+        <w:rPr>
+          <w:rFonts w:ascii="Consolas" w:cs="Consolas" w:eastAsia="Consolas" w:hAnsi="Consolas"/>
+          <w:color w:val="000000"/>
+          <w:sz w:val="14"/>
+          <w:szCs w:val="14"/>
+        </w:rPr>
+        <w:t xml:space="preserve">speed = SPEED * ground.get("speed", 1)  # set in Tiled</w:t>
+      </w:r>
+    </w:p>
+    <w:p>
+      <w:pPr>
+        <w:keepNext/>
+        <w:keepLines/>
+        <w:shd w:fill="F2F4F7" w:color="auto" w:val="clear"/>
+        <w:spacing w:after="0" w:before="0" w:line="220"/>
+        <w:ind w:left="60"/>
+      </w:pPr>
+      <w:r>
+        <w:rPr>
+          <w:rFonts w:ascii="Consolas" w:cs="Consolas" w:eastAsia="Consolas" w:hAnsi="Consolas"/>
+          <w:color w:val="000000"/>
+          <w:sz w:val="14"/>
+          <w:szCs w:val="14"/>
+        </w:rPr>
+        <w:t xml:space="preserve">hills = Background("hills.png", parallax=0.3, y=400)</w:t>
+      </w:r>
+    </w:p>
+    <w:p>
+      <w:pPr>
+        <w:keepNext/>
+        <w:keepLines/>
+        <w:shd w:fill="F2F4F7" w:color="auto" w:val="clear"/>
+        <w:spacing w:after="0" w:before="0" w:line="220"/>
+        <w:ind w:left="60"/>
+      </w:pPr>
+      <w:r>
+        <w:rPr>
+          <w:rFonts w:ascii="Consolas" w:cs="Consolas" w:eastAsia="Consolas" w:hAnsi="Consolas"/>
+          <w:color w:val="000000"/>
+          <w:sz w:val="14"/>
+          <w:szCs w:val="14"/>
+        </w:rPr>
+        <w:t xml:space="preserve">hills.draw(screen, camera)   # before the world; 0 = still</w:t>
       </w:r>
     </w:p>
     <w:p>
@@ -5636,7 +5798,25 @@
           <w:sz w:val="14"/>
           <w:szCs w:val="14"/>
         </w:rPr>
-        <w:t xml:space="preserve">body = TopDownBody(player, solids=walls, speed=200)</w:t>
+        <w:t xml:space="preserve">body = TopDownBody(player, solids=walls, hitbox=10)</w:t>
+      </w:r>
+    </w:p>
+    <w:p>
+      <w:pPr>
+        <w:keepNext/>
+        <w:keepLines/>
+        <w:shd w:fill="F2F4F7" w:color="auto" w:val="clear"/>
+        <w:spacing w:after="0" w:before="0" w:line="220"/>
+        <w:ind w:left="60"/>
+      </w:pPr>
+      <w:r>
+        <w:rPr>
+          <w:rFonts w:ascii="Consolas" w:cs="Consolas" w:eastAsia="Consolas" w:hAnsi="Consolas"/>
+          <w:color w:val="2E7D32"/>
+          <w:sz w:val="14"/>
+          <w:szCs w:val="14"/>
+        </w:rPr>
+        <w:t xml:space="preserve"># hitbox=10: only the bottom 10 px (the feet) hit walls</w:t>
       </w:r>
     </w:p>
     <w:p>

</xml_diff>

<commit_message>
Added Spawner Object with Wave Mechanics
</commit_message>
<xml_diff>
--- a/docs/PygameTkinterGUITools_CheatSheet.docx
+++ b/docs/PygameTkinterGUITools_CheatSheet.docx
@@ -6589,6 +6589,239 @@
         <w:t xml:space="preserve">snake.turn("left")    snake.grow()    snake.hits_self()</w:t>
       </w:r>
     </w:p>
+    <w:p>
+      <w:pPr>
+        <w:keepNext/>
+        <w:spacing w:after="30" w:before="100"/>
+      </w:pPr>
+      <w:r>
+        <w:rPr>
+          <w:rFonts w:ascii="Calibri" w:cs="Calibri" w:eastAsia="Calibri" w:hAnsi="Calibri"/>
+          <w:b/>
+          <w:bCs/>
+          <w:color w:val="1F4E79"/>
+          <w:sz w:val="20"/>
+          <w:szCs w:val="20"/>
+        </w:rPr>
+        <w:t xml:space="preserve">Spawner and waves</w:t>
+      </w:r>
+    </w:p>
+    <w:p>
+      <w:pPr>
+        <w:keepNext/>
+        <w:keepLines/>
+        <w:shd w:fill="F2F4F7" w:color="auto" w:val="clear"/>
+        <w:spacing w:after="0" w:before="0" w:line="220"/>
+        <w:ind w:left="60"/>
+      </w:pPr>
+      <w:r>
+        <w:rPr>
+          <w:rFonts w:ascii="Consolas" w:cs="Consolas" w:eastAsia="Consolas" w:hAnsi="Consolas"/>
+          <w:color w:val="000000"/>
+          <w:sz w:val="14"/>
+          <w:szCs w:val="14"/>
+        </w:rPr>
+        <w:t xml:space="preserve">slimes = Spawner(make_slime, points=corners,</w:t>
+      </w:r>
+    </w:p>
+    <w:p>
+      <w:pPr>
+        <w:keepNext/>
+        <w:keepLines/>
+        <w:shd w:fill="F2F4F7" w:color="auto" w:val="clear"/>
+        <w:spacing w:after="0" w:before="0" w:line="220"/>
+        <w:ind w:left="60"/>
+      </w:pPr>
+      <w:r>
+        <w:rPr>
+          <w:rFonts w:ascii="Consolas" w:cs="Consolas" w:eastAsia="Consolas" w:hAnsi="Consolas"/>
+          <w:color w:val="000000"/>
+          <w:sz w:val="14"/>
+          <w:szCs w:val="14"/>
+        </w:rPr>
+        <w:t xml:space="preserve">                 every=1500, max_alive=6,</w:t>
+      </w:r>
+    </w:p>
+    <w:p>
+      <w:pPr>
+        <w:keepNext/>
+        <w:keepLines/>
+        <w:shd w:fill="F2F4F7" w:color="auto" w:val="clear"/>
+        <w:spacing w:after="0" w:before="0" w:line="220"/>
+        <w:ind w:left="60"/>
+      </w:pPr>
+      <w:r>
+        <w:rPr>
+          <w:rFonts w:ascii="Consolas" w:cs="Consolas" w:eastAsia="Consolas" w:hAnsi="Consolas"/>
+          <w:color w:val="000000"/>
+          <w:sz w:val="14"/>
+          <w:szCs w:val="14"/>
+        </w:rPr>
+        <w:t xml:space="preserve">                 avoid=player, min_distance=150)</w:t>
+      </w:r>
+    </w:p>
+    <w:p>
+      <w:pPr>
+        <w:keepNext/>
+        <w:keepLines/>
+        <w:shd w:fill="F2F4F7" w:color="auto" w:val="clear"/>
+        <w:spacing w:after="0" w:before="0" w:line="220"/>
+        <w:ind w:left="60"/>
+      </w:pPr>
+      <w:r>
+        <w:rPr>
+          <w:rFonts w:ascii="Consolas" w:cs="Consolas" w:eastAsia="Consolas" w:hAnsi="Consolas"/>
+          <w:color w:val="2E7D32"/>
+          <w:sz w:val="14"/>
+          <w:szCs w:val="14"/>
+        </w:rPr>
+        <w:t xml:space="preserve"># make_slime(x, y) makes ONE; slime.kill() = it is gone</w:t>
+      </w:r>
+    </w:p>
+    <w:p>
+      <w:pPr>
+        <w:keepNext/>
+        <w:keepLines/>
+        <w:shd w:fill="F2F4F7" w:color="auto" w:val="clear"/>
+        <w:spacing w:after="0" w:before="0" w:line="220"/>
+        <w:ind w:left="60"/>
+      </w:pPr>
+      <w:r>
+        <w:rPr>
+          <w:rFonts w:ascii="Consolas" w:cs="Consolas" w:eastAsia="Consolas" w:hAnsi="Consolas"/>
+          <w:color w:val="000000"/>
+          <w:sz w:val="14"/>
+          <w:szCs w:val="14"/>
+        </w:rPr>
+        <w:t xml:space="preserve">slimes.update(tick)       slimes.draw(screen, camera)</w:t>
+      </w:r>
+    </w:p>
+    <w:p>
+      <w:pPr>
+        <w:keepNext/>
+        <w:keepLines/>
+        <w:shd w:fill="F2F4F7" w:color="auto" w:val="clear"/>
+        <w:spacing w:after="0" w:before="0" w:line="220"/>
+        <w:ind w:left="60"/>
+      </w:pPr>
+      <w:r>
+        <w:rPr>
+          <w:rFonts w:ascii="Consolas" w:cs="Consolas" w:eastAsia="Consolas" w:hAnsi="Consolas"/>
+          <w:color w:val="000000"/>
+          <w:sz w:val="14"/>
+          <w:szCs w:val="14"/>
+        </w:rPr>
+        <w:t xml:space="preserve">for slime in slimes:      # every one still alive</w:t>
+      </w:r>
+    </w:p>
+    <w:p>
+      <w:pPr>
+        <w:keepNext/>
+        <w:keepLines/>
+        <w:shd w:fill="F2F4F7" w:color="auto" w:val="clear"/>
+        <w:spacing w:after="0" w:before="0" w:line="220"/>
+        <w:ind w:left="60"/>
+      </w:pPr>
+      <w:r>
+        <w:rPr>
+          <w:rFonts w:ascii="Consolas" w:cs="Consolas" w:eastAsia="Consolas" w:hAnsi="Consolas"/>
+          <w:color w:val="000000"/>
+          <w:sz w:val="14"/>
+          <w:szCs w:val="14"/>
+        </w:rPr>
+        <w:t xml:space="preserve">    slime.brain.update(tick)</w:t>
+      </w:r>
+    </w:p>
+    <w:p>
+      <w:pPr>
+        <w:keepNext/>
+        <w:keepLines/>
+        <w:shd w:fill="F2F4F7" w:color="auto" w:val="clear"/>
+        <w:spacing w:after="0" w:before="0" w:line="220"/>
+        <w:ind w:left="60"/>
+      </w:pPr>
+      <w:r>
+        <w:rPr>
+          <w:rFonts w:ascii="Consolas" w:cs="Consolas" w:eastAsia="Consolas" w:hAnsi="Consolas"/>
+          <w:color w:val="000000"/>
+          <w:sz w:val="14"/>
+          <w:szCs w:val="14"/>
+        </w:rPr>
+        <w:t xml:space="preserve">waves = Waves(slimes, [3, 5, {"count": 8, "make": boss}],</w:t>
+      </w:r>
+    </w:p>
+    <w:p>
+      <w:pPr>
+        <w:keepNext/>
+        <w:keepLines/>
+        <w:shd w:fill="F2F4F7" w:color="auto" w:val="clear"/>
+        <w:spacing w:after="0" w:before="0" w:line="220"/>
+        <w:ind w:left="60"/>
+      </w:pPr>
+      <w:r>
+        <w:rPr>
+          <w:rFonts w:ascii="Consolas" w:cs="Consolas" w:eastAsia="Consolas" w:hAnsi="Consolas"/>
+          <w:color w:val="000000"/>
+          <w:sz w:val="14"/>
+          <w:szCs w:val="14"/>
+        </w:rPr>
+        <w:t xml:space="preserve">              break_ms=3000, on_all_done=you_win)</w:t>
+      </w:r>
+    </w:p>
+    <w:p>
+      <w:pPr>
+        <w:keepNext/>
+        <w:keepLines/>
+        <w:shd w:fill="F2F4F7" w:color="auto" w:val="clear"/>
+        <w:spacing w:after="0" w:before="0" w:line="220"/>
+        <w:ind w:left="60"/>
+      </w:pPr>
+      <w:r>
+        <w:rPr>
+          <w:rFonts w:ascii="Consolas" w:cs="Consolas" w:eastAsia="Consolas" w:hAnsi="Consolas"/>
+          <w:color w:val="000000"/>
+          <w:sz w:val="14"/>
+          <w:szCs w:val="14"/>
+        </w:rPr>
+        <w:t xml:space="preserve">waves.update(tick)        # instead of slimes.update</w:t>
+      </w:r>
+    </w:p>
+    <w:p>
+      <w:pPr>
+        <w:keepNext/>
+        <w:keepLines/>
+        <w:shd w:fill="F2F4F7" w:color="auto" w:val="clear"/>
+        <w:spacing w:after="0" w:before="0" w:line="220"/>
+        <w:ind w:left="60"/>
+      </w:pPr>
+      <w:r>
+        <w:rPr>
+          <w:rFonts w:ascii="Consolas" w:cs="Consolas" w:eastAsia="Consolas" w:hAnsi="Consolas"/>
+          <w:color w:val="000000"/>
+          <w:sz w:val="14"/>
+          <w:szCs w:val="14"/>
+        </w:rPr>
+        <w:t xml:space="preserve">label.config(text=waves.text())   # "Wave 2 of 3 - 4 left"</w:t>
+      </w:r>
+    </w:p>
+    <w:p>
+      <w:pPr>
+        <w:keepNext w:val="false"/>
+        <w:keepLines/>
+        <w:shd w:fill="F2F4F7" w:color="auto" w:val="clear"/>
+        <w:spacing w:after="40" w:before="0" w:line="220"/>
+        <w:ind w:left="60"/>
+      </w:pPr>
+      <w:r>
+        <w:rPr>
+          <w:rFonts w:ascii="Consolas" w:cs="Consolas" w:eastAsia="Consolas" w:hAnsi="Consolas"/>
+          <w:color w:val="2E7D32"/>
+          <w:sz w:val="14"/>
+          <w:szCs w:val="14"/>
+        </w:rPr>
+        <w:t xml:space="preserve"># points: (x, y), list, Rect, level.spawn_points, a sprite</w:t>
+      </w:r>
+    </w:p>
     <w:sectPr>
       <w:footerReference w:type="default" r:id="rId7"/>
       <w:pgSz w:w="11906" w:h="16838" w:orient="portrait"/>

</xml_diff>

<commit_message>
Added Dialogue Object for Conversation Mechanics.
</commit_message>
<xml_diff>
--- a/docs/PygameTkinterGUITools_CheatSheet.docx
+++ b/docs/PygameTkinterGUITools_CheatSheet.docx
@@ -3536,6 +3536,275 @@
       </w:r>
     </w:p>
     <w:p>
+      <w:pPr>
+        <w:keepNext/>
+        <w:spacing w:after="30" w:before="100"/>
+      </w:pPr>
+      <w:r>
+        <w:rPr>
+          <w:rFonts w:ascii="Calibri" w:cs="Calibri" w:eastAsia="Calibri" w:hAnsi="Calibri"/>
+          <w:b/>
+          <w:bCs/>
+          <w:color w:val="1F4E79"/>
+          <w:sz w:val="20"/>
+          <w:szCs w:val="20"/>
+        </w:rPr>
+        <w:t>Conversations (Dialogue)</w:t>
+      </w:r>
+    </w:p>
+    <w:p>
+      <w:pPr>
+        <w:keepNext/>
+        <w:keepLines/>
+        <w:shd w:fill="F2F4F7" w:color="auto" w:val="clear"/>
+        <w:spacing w:after="0" w:before="20" w:line="220"/>
+        <w:ind w:left="60"/>
+      </w:pPr>
+      <w:r>
+        <w:rPr>
+          <w:rFonts w:ascii="Consolas" w:cs="Consolas" w:eastAsia="Consolas" w:hAnsi="Consolas"/>
+          <w:color w:val="000000"/>
+          <w:sz w:val="14"/>
+          <w:szCs w:val="14"/>
+        </w:rPr>
+        <w:t>talk = Dialogue(20, 400, 760, 180, script={</w:t>
+      </w:r>
+    </w:p>
+    <w:p>
+      <w:pPr>
+        <w:keepNext/>
+        <w:keepLines/>
+        <w:shd w:fill="F2F4F7" w:color="auto" w:val="clear"/>
+        <w:spacing w:after="0" w:before="20" w:line="220"/>
+        <w:ind w:left="60"/>
+      </w:pPr>
+      <w:r>
+        <w:rPr>
+          <w:rFonts w:ascii="Consolas" w:cs="Consolas" w:eastAsia="Consolas" w:hAnsi="Consolas"/>
+          <w:color w:val="000000"/>
+          <w:sz w:val="14"/>
+          <w:szCs w:val="14"/>
+        </w:rPr>
+        <w:t xml:space="preserve">  "start": [{"speaker": "Wizard", "text": "Hi!"},</w:t>
+      </w:r>
+    </w:p>
+    <w:p>
+      <w:pPr>
+        <w:keepNext/>
+        <w:keepLines/>
+        <w:shd w:fill="F2F4F7" w:color="auto" w:val="clear"/>
+        <w:spacing w:after="0" w:before="20" w:line="220"/>
+        <w:ind w:left="60"/>
+      </w:pPr>
+      <w:r>
+        <w:rPr>
+          <w:rFonts w:ascii="Consolas" w:cs="Consolas" w:eastAsia="Consolas" w:hAnsi="Consolas"/>
+          <w:color w:val="000000"/>
+          <w:sz w:val="14"/>
+          <w:szCs w:val="14"/>
+        </w:rPr>
+        <w:t xml:space="preserve">            "Take this sword?",       # same speaker</w:t>
+      </w:r>
+    </w:p>
+    <w:p>
+      <w:pPr>
+        <w:keepNext/>
+        <w:keepLines/>
+        <w:shd w:fill="F2F4F7" w:color="auto" w:val="clear"/>
+        <w:spacing w:after="0" w:before="20" w:line="220"/>
+        <w:ind w:left="60"/>
+      </w:pPr>
+      <w:r>
+        <w:rPr>
+          <w:rFonts w:ascii="Consolas" w:cs="Consolas" w:eastAsia="Consolas" w:hAnsi="Consolas"/>
+          <w:color w:val="000000"/>
+          <w:sz w:val="14"/>
+          <w:szCs w:val="14"/>
+        </w:rPr>
+        <w:t xml:space="preserve">            {"text": "Well?", "choices": [</w:t>
+      </w:r>
+    </w:p>
+    <w:p>
+      <w:pPr>
+        <w:keepNext/>
+        <w:keepLines/>
+        <w:shd w:fill="F2F4F7" w:color="auto" w:val="clear"/>
+        <w:spacing w:after="0" w:before="20" w:line="220"/>
+        <w:ind w:left="60"/>
+      </w:pPr>
+      <w:r>
+        <w:rPr>
+          <w:rFonts w:ascii="Consolas" w:cs="Consolas" w:eastAsia="Consolas" w:hAnsi="Consolas"/>
+          <w:color w:val="000000"/>
+          <w:sz w:val="14"/>
+          <w:szCs w:val="14"/>
+        </w:rPr>
+        <w:t xml:space="preserve">                ["Yes", "take"], ["No", "end"]]}],</w:t>
+      </w:r>
+    </w:p>
+    <w:p>
+      <w:pPr>
+        <w:keepNext/>
+        <w:keepLines/>
+        <w:shd w:fill="F2F4F7" w:color="auto" w:val="clear"/>
+        <w:spacing w:after="0" w:before="20" w:line="220"/>
+        <w:ind w:left="60"/>
+      </w:pPr>
+      <w:r>
+        <w:rPr>
+          <w:rFonts w:ascii="Consolas" w:cs="Consolas" w:eastAsia="Consolas" w:hAnsi="Consolas"/>
+          <w:color w:val="000000"/>
+          <w:sz w:val="14"/>
+          <w:szCs w:val="14"/>
+        </w:rPr>
+        <w:t xml:space="preserve">  "take": [{"text": "Bye!", "set": {"sword": True}}]},</w:t>
+      </w:r>
+    </w:p>
+    <w:p>
+      <w:pPr>
+        <w:keepNext/>
+        <w:keepLines/>
+        <w:shd w:fill="F2F4F7" w:color="auto" w:val="clear"/>
+        <w:spacing w:after="0" w:before="20" w:line="220"/>
+        <w:ind w:left="60"/>
+      </w:pPr>
+      <w:r>
+        <w:rPr>
+          <w:rFonts w:ascii="Consolas" w:cs="Consolas" w:eastAsia="Consolas" w:hAnsi="Consolas"/>
+          <w:color w:val="000000"/>
+          <w:sz w:val="14"/>
+          <w:szCs w:val="14"/>
+        </w:rPr>
+        <w:t xml:space="preserve">  speakers={"Wizard": {"portrait": "wizard.png"}})</w:t>
+      </w:r>
+    </w:p>
+    <w:p>
+      <w:pPr>
+        <w:keepNext/>
+        <w:keepLines/>
+        <w:shd w:fill="F2F4F7" w:color="auto" w:val="clear"/>
+        <w:spacing w:after="0" w:before="20" w:line="220"/>
+        <w:ind w:left="60"/>
+      </w:pPr>
+      <w:r>
+        <w:rPr>
+          <w:rFonts w:ascii="Consolas" w:cs="Consolas" w:eastAsia="Consolas" w:hAnsi="Consolas"/>
+          <w:color w:val="000000"/>
+          <w:sz w:val="14"/>
+          <w:szCs w:val="14"/>
+        </w:rPr>
+        <w:t>talk.start()     talk.start("take")     talk.say("Hi!")</w:t>
+      </w:r>
+    </w:p>
+    <w:p>
+      <w:pPr>
+        <w:keepNext/>
+        <w:keepLines/>
+        <w:shd w:fill="F2F4F7" w:color="auto" w:val="clear"/>
+        <w:spacing w:after="0" w:before="20" w:line="220"/>
+        <w:ind w:left="60"/>
+      </w:pPr>
+      <w:r>
+        <w:rPr>
+          <w:rFonts w:ascii="Consolas" w:cs="Consolas" w:eastAsia="Consolas" w:hAnsi="Consolas"/>
+          <w:color w:val="000000"/>
+          <w:sz w:val="14"/>
+          <w:szCs w:val="14"/>
+        </w:rPr>
+        <w:t>if talk.handle_event(event):   # FIRST: True = used</w:t>
+      </w:r>
+    </w:p>
+    <w:p>
+      <w:pPr>
+        <w:keepNext/>
+        <w:keepLines/>
+        <w:shd w:fill="F2F4F7" w:color="auto" w:val="clear"/>
+        <w:spacing w:after="0" w:before="20" w:line="220"/>
+        <w:ind w:left="60"/>
+      </w:pPr>
+      <w:r>
+        <w:rPr>
+          <w:rFonts w:ascii="Consolas" w:cs="Consolas" w:eastAsia="Consolas" w:hAnsi="Consolas"/>
+          <w:color w:val="000000"/>
+          <w:sz w:val="14"/>
+          <w:szCs w:val="14"/>
+        </w:rPr>
+        <w:t xml:space="preserve">    continue</w:t>
+      </w:r>
+    </w:p>
+    <w:p>
+      <w:pPr>
+        <w:keepNext/>
+        <w:keepLines/>
+        <w:shd w:fill="F2F4F7" w:color="auto" w:val="clear"/>
+        <w:spacing w:after="0" w:before="20" w:line="220"/>
+        <w:ind w:left="60"/>
+      </w:pPr>
+      <w:r>
+        <w:rPr>
+          <w:rFonts w:ascii="Consolas" w:cs="Consolas" w:eastAsia="Consolas" w:hAnsi="Consolas"/>
+          <w:color w:val="000000"/>
+          <w:sz w:val="14"/>
+          <w:szCs w:val="14"/>
+        </w:rPr>
+        <w:t>talk.update(tick)     talk.draw(screen)    # draw LAST</w:t>
+      </w:r>
+    </w:p>
+    <w:p>
+      <w:pPr>
+        <w:keepNext/>
+        <w:keepLines/>
+        <w:shd w:fill="F2F4F7" w:color="auto" w:val="clear"/>
+        <w:spacing w:after="0" w:before="20" w:line="220"/>
+        <w:ind w:left="60"/>
+      </w:pPr>
+      <w:r>
+        <w:rPr>
+          <w:rFonts w:ascii="Consolas" w:cs="Consolas" w:eastAsia="Consolas" w:hAnsi="Consolas"/>
+          <w:color w:val="000000"/>
+          <w:sz w:val="14"/>
+          <w:szCs w:val="14"/>
+        </w:rPr>
+        <w:t>if not talk.talking: ...       # e.g. move the player</w:t>
+      </w:r>
+    </w:p>
+    <w:p>
+      <w:pPr>
+        <w:keepNext/>
+        <w:keepLines/>
+        <w:shd w:fill="F2F4F7" w:color="auto" w:val="clear"/>
+        <w:spacing w:after="0" w:before="20" w:line="220"/>
+        <w:ind w:left="60"/>
+      </w:pPr>
+      <w:r>
+        <w:rPr>
+          <w:rFonts w:ascii="Consolas" w:cs="Consolas" w:eastAsia="Consolas" w:hAnsi="Consolas"/>
+          <w:color w:val="2E7D32"/>
+          <w:sz w:val="14"/>
+          <w:szCs w:val="14"/>
+        </w:rPr>
+        <w:t># line keys: text speaker portrait choices goto set do</w:t>
+      </w:r>
+    </w:p>
+    <w:p>
+      <w:pPr>
+        <w:keepNext w:val="false"/>
+        <w:keepLines/>
+        <w:shd w:fill="F2F4F7" w:color="auto" w:val="clear"/>
+        <w:spacing w:after="40" w:before="0" w:line="220"/>
+        <w:ind w:left="60"/>
+      </w:pPr>
+      <w:r>
+        <w:rPr>
+          <w:rFonts w:ascii="Consolas" w:cs="Consolas" w:eastAsia="Consolas" w:hAnsi="Consolas"/>
+          <w:color w:val="2E7D32"/>
+          <w:sz w:val="14"/>
+          <w:szCs w:val="14"/>
+        </w:rPr>
+        <w:t># script="talk.json" works too. Save talk.flags</w:t>
+      </w:r>
+    </w:p>
+    <w:p>
       <w:r>
         <w:br w:type="page"/>
       </w:r>

</xml_diff>